<commit_message>
docs: fecha issues #6, #18, #22, #23, #24 e #50 da Sprint 1
Atualiza README, CONTRIBUTING, STATUS, Requisitos_RN e Matriz de Rastreabilidade refletindo: notacao UML confirmada com o orientador (#18), estrutura da funcao objetivo do RN03 fechada (#6), especificacao de graficos por bloco tematico (#22), e formalizacao das decisoes ja tomadas para cruzamento garcom x cliente (#23), ferramenta de analise (#24) e tratamento LGPD de dados brutos (#50). Sprint 1 nao fecha ainda: issue #26 (validar RN03 com o orientador) permanece em aberto, pendente da calibracao numerica com o CSV ja exportado.
</commit_message>
<xml_diff>
--- a/docs/requisitos/GASTRA_Requisitos_RN.docx
+++ b/docs/requisitos/GASTRA_Requisitos_RN.docx
@@ -4,7 +4,7 @@
   <w:body>
     <w:p>
       <w:pPr>
-        <w:spacing w:after="80"/>
+        <w:spacing w:after="150"/>
       </w:pPr>
       <w:r>
         <w:rPr>
@@ -18,41 +18,40 @@
     </w:p>
     <w:p>
       <w:pPr>
-        <w:spacing w:after="160"/>
-      </w:pPr>
-      <w:r>
-        <w:rPr>
-          <w:i/>
-          <w:iCs/>
-          <w:color w:val="555555"/>
-        </w:rPr>
-        <w:t xml:space="preserve">Módulo de comandas (adicional) e blocos analíticos — documento de trabalho</w:t>
-      </w:r>
-    </w:p>
-    <w:p>
-      <w:pPr>
-        <w:spacing w:after="160"/>
-      </w:pPr>
-      <w:r>
-        <w:t xml:space="preserve">TG — FATEC Araraquara | Autores: Daniel (Danih) e Pedro | Orientador: Prof. Me. Leonardo José de Lima Ferrucci</w:t>
-      </w:r>
-    </w:p>
-    <w:p>
-      <w:pPr>
-        <w:spacing w:after="160"/>
+        <w:spacing w:after="200"/>
       </w:pPr>
       <w:r>
         <w:rPr>
           <w:i/>
           <w:iCs/>
         </w:rPr>
-        <w:t xml:space="preserve">Versão: 21/08/2026 — revisão pós-entrevista Cocobambu e validação de escopo com o orientador</w:t>
+        <w:t xml:space="preserve">Módulo de comandas (adicional) e blocos analíticos — documento de trabalho</w:t>
+      </w:r>
+    </w:p>
+    <w:p>
+      <w:pPr>
+        <w:spacing w:after="200"/>
+      </w:pPr>
+      <w:r>
+        <w:t xml:space="preserve">TG — FATEC Araraquara | Autores: Daniel (Danih) e Pedro | Orientador: Prof. Me. Leonardo José de Lima Ferrucci</w:t>
+      </w:r>
+    </w:p>
+    <w:p>
+      <w:pPr>
+        <w:spacing w:after="200"/>
+      </w:pPr>
+      <w:r>
+        <w:rPr>
+          <w:i/>
+          <w:iCs/>
+        </w:rPr>
+        <w:t xml:space="preserve">Versão: 22/08/2026 — fechamento da Sprint 1: função objetivo do RN03 (issue #6) e notação de diagramas confirmadas</w:t>
       </w:r>
     </w:p>
     <w:p>
       <w:pPr>
         <w:pStyle w:val="Heading1"/>
-        <w:spacing w:after="160" w:before="320"/>
+        <w:spacing w:after="150" w:before="300"/>
       </w:pPr>
       <w:r>
         <w:t xml:space="preserve">1. Escopo considerado neste documento</w:t>
@@ -60,7 +59,7 @@
     </w:p>
     <w:p>
       <w:pPr>
-        <w:spacing w:after="160"/>
+        <w:spacing w:after="200"/>
       </w:pPr>
       <w:r>
         <w:t xml:space="preserve">Atualização de escopo validada com o orientador (21/08/2026): o foco do TG permanece nos quatro blocos analíticos originais do projeto de pesquisa formal (Gastra.pdf) — BI, Ciência de Dados, Programação Linear e LGPD. O módulo de comandas foi aprovado, mas como componente adicional que alimenta esses blocos com dados operacionais reais, não como entrega central do trabalho.</w:t>
@@ -68,7 +67,7 @@
     </w:p>
     <w:p>
       <w:pPr>
-        <w:spacing w:after="160"/>
+        <w:spacing w:after="200"/>
       </w:pPr>
       <w:r>
         <w:t xml:space="preserve">Dentro do módulo de comandas, há uma subdivisão de prioridade que precisa ficar clara em qualquer leitura deste documento:</w:t>
@@ -79,9 +78,9 @@
         <w:pStyle w:val="ListParagraph"/>
         <w:numPr>
           <w:ilvl w:val="0"/>
-          <w:numId w:val="2"/>
+          <w:numId w:val="1"/>
         </w:numPr>
-        <w:spacing w:after="80"/>
+        <w:spacing w:after="150"/>
       </w:pPr>
       <w:r>
         <w:t xml:space="preserve">Núcleo do módulo de comandas (abrir/registrar pedido/fechar comanda) — aprovado como adicional necessário.</w:t>
@@ -92,9 +91,9 @@
         <w:pStyle w:val="ListParagraph"/>
         <w:numPr>
           <w:ilvl w:val="0"/>
-          <w:numId w:val="2"/>
+          <w:numId w:val="1"/>
         </w:numPr>
-        <w:spacing w:after="80"/>
+        <w:spacing w:after="150"/>
       </w:pPr>
       <w:r>
         <w:t xml:space="preserve">Extras condicionados a tempo disponível: cardápio digital para consulta (opção B) e consulta da comanda em tempo real pelo cliente; lista de pendências do garçom (achado da entrevista Cocobambu).</w:t>
@@ -105,9 +104,9 @@
         <w:pStyle w:val="ListParagraph"/>
         <w:numPr>
           <w:ilvl w:val="0"/>
-          <w:numId w:val="2"/>
+          <w:numId w:val="1"/>
         </w:numPr>
-        <w:spacing w:after="80"/>
+        <w:spacing w:after="150"/>
       </w:pPr>
       <w:r>
         <w:t xml:space="preserve">Fora do escopo do TG: qualquer integração com a cozinha (acesso a pedidos, confirmação de preparo). Tratada explicitamente como feature futura, pós-defesa — não entra nem como extra condicional.</w:t>
@@ -115,17 +114,12 @@
     </w:p>
     <w:p>
       <w:pPr>
-        <w:pBdr>
-          <w:left w:val="single" w:color="999999" w:sz="12" w:space="8"/>
-        </w:pBdr>
-        <w:spacing w:after="200" w:before="120"/>
-        <w:ind w:left="200"/>
+        <w:spacing w:after="200"/>
       </w:pPr>
       <w:r>
         <w:rPr>
           <w:i/>
           <w:iCs/>
-          <w:color w:val="555555"/>
         </w:rPr>
         <w:t xml:space="preserve">Esta seção substitui a versão de 17/08/2026, que tratava comandas e cardápio digital como pendentes de validação. A validação ocorreu em 21/08/2026; os extras (cardápio digital, comanda em tempo real, lista de pendências) continuam formalmente aprovados apenas como escopo condicional — não são compromisso de entrega.</w:t>
       </w:r>
@@ -133,7 +127,7 @@
     <w:p>
       <w:pPr>
         <w:pStyle w:val="Heading1"/>
-        <w:spacing w:after="160" w:before="320"/>
+        <w:spacing w:after="150" w:before="300"/>
       </w:pPr>
       <w:r>
         <w:t xml:space="preserve">2. Requisitos Funcionais (RF)</w:t>
@@ -141,7 +135,7 @@
     </w:p>
     <w:p>
       <w:pPr>
-        <w:spacing w:after="160"/>
+        <w:spacing w:after="200"/>
       </w:pPr>
       <w:r>
         <w:t xml:space="preserve">Um Requisito Funcional descreve algo que o sistema deve fazer — uma função ou comportamento observável, associado a um ator que a aciona ou que dela se beneficia.</w:t>
@@ -149,7 +143,7 @@
     </w:p>
     <w:tbl>
       <w:tblPr>
-        <w:tblW w:type="dxa" w:w="9360"/>
+        <w:tblW w:type="dxa" w:w="9500"/>
         <w:tblBorders>
           <w:top w:val="single" w:color="auto" w:sz="4"/>
           <w:left w:val="single" w:color="auto" w:sz="4"/>
@@ -161,9 +155,9 @@
       </w:tblPr>
       <w:tblGrid>
         <w:gridCol w:w="700"/>
-        <w:gridCol w:w="4700"/>
-        <w:gridCol w:w="1560"/>
-        <w:gridCol w:w="2400"/>
+        <w:gridCol w:w="4200"/>
+        <w:gridCol w:w="1400"/>
+        <w:gridCol w:w="3200"/>
       </w:tblGrid>
       <w:tr>
         <w:trPr>
@@ -172,16 +166,19 @@
         <w:tc>
           <w:tcPr>
             <w:tcW w:type="dxa" w:w="700"/>
-            <w:shd w:fill="2F5233" w:val="clear"/>
+            <w:shd w:fill="D9E2F3" w:val="clear"/>
+            <w:tcMar>
+              <w:top w:type="dxa" w:w="100"/>
+              <w:left w:type="dxa" w:w="120"/>
+              <w:bottom w:type="dxa" w:w="100"/>
+              <w:right w:type="dxa" w:w="120"/>
+            </w:tcMar>
           </w:tcPr>
           <w:p>
             <w:r>
               <w:rPr>
                 <w:b/>
                 <w:bCs/>
-                <w:color w:val="FFFFFF"/>
-                <w:sz w:val="18"/>
-                <w:szCs w:val="18"/>
               </w:rPr>
               <w:t xml:space="preserve">ID</w:t>
             </w:r>
@@ -189,17 +186,20 @@
         </w:tc>
         <w:tc>
           <w:tcPr>
-            <w:tcW w:type="dxa" w:w="4700"/>
-            <w:shd w:fill="2F5233" w:val="clear"/>
+            <w:tcW w:type="dxa" w:w="4200"/>
+            <w:shd w:fill="D9E2F3" w:val="clear"/>
+            <w:tcMar>
+              <w:top w:type="dxa" w:w="100"/>
+              <w:left w:type="dxa" w:w="120"/>
+              <w:bottom w:type="dxa" w:w="100"/>
+              <w:right w:type="dxa" w:w="120"/>
+            </w:tcMar>
           </w:tcPr>
           <w:p>
             <w:r>
               <w:rPr>
                 <w:b/>
                 <w:bCs/>
-                <w:color w:val="FFFFFF"/>
-                <w:sz w:val="18"/>
-                <w:szCs w:val="18"/>
               </w:rPr>
               <w:t xml:space="preserve">Descrição</w:t>
             </w:r>
@@ -207,17 +207,20 @@
         </w:tc>
         <w:tc>
           <w:tcPr>
-            <w:tcW w:type="dxa" w:w="1560"/>
-            <w:shd w:fill="2F5233" w:val="clear"/>
+            <w:tcW w:type="dxa" w:w="1400"/>
+            <w:shd w:fill="D9E2F3" w:val="clear"/>
+            <w:tcMar>
+              <w:top w:type="dxa" w:w="100"/>
+              <w:left w:type="dxa" w:w="120"/>
+              <w:bottom w:type="dxa" w:w="100"/>
+              <w:right w:type="dxa" w:w="120"/>
+            </w:tcMar>
           </w:tcPr>
           <w:p>
             <w:r>
               <w:rPr>
                 <w:b/>
                 <w:bCs/>
-                <w:color w:val="FFFFFF"/>
-                <w:sz w:val="18"/>
-                <w:szCs w:val="18"/>
               </w:rPr>
               <w:t xml:space="preserve">Ator(es)</w:t>
             </w:r>
@@ -225,17 +228,20 @@
         </w:tc>
         <w:tc>
           <w:tcPr>
-            <w:tcW w:type="dxa" w:w="2400"/>
-            <w:shd w:fill="2F5233" w:val="clear"/>
+            <w:tcW w:type="dxa" w:w="3200"/>
+            <w:shd w:fill="D9E2F3" w:val="clear"/>
+            <w:tcMar>
+              <w:top w:type="dxa" w:w="100"/>
+              <w:left w:type="dxa" w:w="120"/>
+              <w:bottom w:type="dxa" w:w="100"/>
+              <w:right w:type="dxa" w:w="120"/>
+            </w:tcMar>
           </w:tcPr>
           <w:p>
             <w:r>
               <w:rPr>
                 <w:b/>
                 <w:bCs/>
-                <w:color w:val="FFFFFF"/>
-                <w:sz w:val="18"/>
-                <w:szCs w:val="18"/>
               </w:rPr>
               <w:t xml:space="preserve">Justificativa / Origem</w:t>
             </w:r>
@@ -246,55 +252,63 @@
         <w:tc>
           <w:tcPr>
             <w:tcW w:type="dxa" w:w="700"/>
-          </w:tcPr>
-          <w:p>
-            <w:r>
-              <w:rPr>
-                <w:sz w:val="18"/>
-                <w:szCs w:val="18"/>
-              </w:rPr>
+            <w:tcMar>
+              <w:top w:type="dxa" w:w="100"/>
+              <w:left w:type="dxa" w:w="120"/>
+              <w:bottom w:type="dxa" w:w="100"/>
+              <w:right w:type="dxa" w:w="120"/>
+            </w:tcMar>
+          </w:tcPr>
+          <w:p>
+            <w:r>
               <w:t xml:space="preserve">RF01</w:t>
             </w:r>
           </w:p>
         </w:tc>
         <w:tc>
           <w:tcPr>
-            <w:tcW w:type="dxa" w:w="4700"/>
-          </w:tcPr>
-          <w:p>
-            <w:r>
-              <w:rPr>
-                <w:sz w:val="18"/>
-                <w:szCs w:val="18"/>
-              </w:rPr>
+            <w:tcW w:type="dxa" w:w="4200"/>
+            <w:tcMar>
+              <w:top w:type="dxa" w:w="100"/>
+              <w:left w:type="dxa" w:w="120"/>
+              <w:bottom w:type="dxa" w:w="100"/>
+              <w:right w:type="dxa" w:w="120"/>
+            </w:tcMar>
+          </w:tcPr>
+          <w:p>
+            <w:r>
               <w:t xml:space="preserve">O sistema deve permitir que o Garçom abra uma comanda vinculada a uma mesa específica.</w:t>
             </w:r>
           </w:p>
         </w:tc>
         <w:tc>
           <w:tcPr>
-            <w:tcW w:type="dxa" w:w="1560"/>
-          </w:tcPr>
-          <w:p>
-            <w:r>
-              <w:rPr>
-                <w:sz w:val="18"/>
-                <w:szCs w:val="18"/>
-              </w:rPr>
+            <w:tcW w:type="dxa" w:w="1400"/>
+            <w:tcMar>
+              <w:top w:type="dxa" w:w="100"/>
+              <w:left w:type="dxa" w:w="120"/>
+              <w:bottom w:type="dxa" w:w="100"/>
+              <w:right w:type="dxa" w:w="120"/>
+            </w:tcMar>
+          </w:tcPr>
+          <w:p>
+            <w:r>
               <w:t xml:space="preserve">Garçom</w:t>
             </w:r>
           </w:p>
         </w:tc>
         <w:tc>
           <w:tcPr>
-            <w:tcW w:type="dxa" w:w="2400"/>
-          </w:tcPr>
-          <w:p>
-            <w:r>
-              <w:rPr>
-                <w:sz w:val="18"/>
-                <w:szCs w:val="18"/>
-              </w:rPr>
+            <w:tcW w:type="dxa" w:w="3200"/>
+            <w:tcMar>
+              <w:top w:type="dxa" w:w="100"/>
+              <w:left w:type="dxa" w:w="120"/>
+              <w:bottom w:type="dxa" w:w="100"/>
+              <w:right w:type="dxa" w:w="120"/>
+            </w:tcMar>
+          </w:tcPr>
+          <w:p>
+            <w:r>
               <w:t xml:space="preserve">Núcleo do módulo de comandas — adicional aprovado (21/08/2026).</w:t>
             </w:r>
           </w:p>
@@ -304,55 +318,63 @@
         <w:tc>
           <w:tcPr>
             <w:tcW w:type="dxa" w:w="700"/>
-          </w:tcPr>
-          <w:p>
-            <w:r>
-              <w:rPr>
-                <w:sz w:val="18"/>
-                <w:szCs w:val="18"/>
-              </w:rPr>
+            <w:tcMar>
+              <w:top w:type="dxa" w:w="100"/>
+              <w:left w:type="dxa" w:w="120"/>
+              <w:bottom w:type="dxa" w:w="100"/>
+              <w:right w:type="dxa" w:w="120"/>
+            </w:tcMar>
+          </w:tcPr>
+          <w:p>
+            <w:r>
               <w:t xml:space="preserve">RF02</w:t>
             </w:r>
           </w:p>
         </w:tc>
         <w:tc>
           <w:tcPr>
-            <w:tcW w:type="dxa" w:w="4700"/>
-          </w:tcPr>
-          <w:p>
-            <w:r>
-              <w:rPr>
-                <w:sz w:val="18"/>
-                <w:szCs w:val="18"/>
-              </w:rPr>
+            <w:tcW w:type="dxa" w:w="4200"/>
+            <w:tcMar>
+              <w:top w:type="dxa" w:w="100"/>
+              <w:left w:type="dxa" w:w="120"/>
+              <w:bottom w:type="dxa" w:w="100"/>
+              <w:right w:type="dxa" w:w="120"/>
+            </w:tcMar>
+          </w:tcPr>
+          <w:p>
+            <w:r>
               <w:t xml:space="preserve">O sistema deve sugerir automaticamente a composição da mesa, permitindo ao Garçom confirmar ou ajustar.</w:t>
             </w:r>
           </w:p>
         </w:tc>
         <w:tc>
           <w:tcPr>
-            <w:tcW w:type="dxa" w:w="1560"/>
-          </w:tcPr>
-          <w:p>
-            <w:r>
-              <w:rPr>
-                <w:sz w:val="18"/>
-                <w:szCs w:val="18"/>
-              </w:rPr>
+            <w:tcW w:type="dxa" w:w="1400"/>
+            <w:tcMar>
+              <w:top w:type="dxa" w:w="100"/>
+              <w:left w:type="dxa" w:w="120"/>
+              <w:bottom w:type="dxa" w:w="100"/>
+              <w:right w:type="dxa" w:w="120"/>
+            </w:tcMar>
+          </w:tcPr>
+          <w:p>
+            <w:r>
               <w:t xml:space="preserve">Garçom</w:t>
             </w:r>
           </w:p>
         </w:tc>
         <w:tc>
           <w:tcPr>
-            <w:tcW w:type="dxa" w:w="2400"/>
-          </w:tcPr>
-          <w:p>
-            <w:r>
-              <w:rPr>
-                <w:sz w:val="18"/>
-                <w:szCs w:val="18"/>
-              </w:rPr>
+            <w:tcW w:type="dxa" w:w="3200"/>
+            <w:tcMar>
+              <w:top w:type="dxa" w:w="100"/>
+              <w:left w:type="dxa" w:w="120"/>
+              <w:bottom w:type="dxa" w:w="100"/>
+              <w:right w:type="dxa" w:w="120"/>
+            </w:tcMar>
+          </w:tcPr>
+          <w:p>
+            <w:r>
               <w:t xml:space="preserve">Decisão de design (13/08/2026); confirmado por entrevista — sem item infantil pedido, sistema não tem como inferir sozinho.</w:t>
             </w:r>
           </w:p>
@@ -362,55 +384,63 @@
         <w:tc>
           <w:tcPr>
             <w:tcW w:type="dxa" w:w="700"/>
-          </w:tcPr>
-          <w:p>
-            <w:r>
-              <w:rPr>
-                <w:sz w:val="18"/>
-                <w:szCs w:val="18"/>
-              </w:rPr>
+            <w:tcMar>
+              <w:top w:type="dxa" w:w="100"/>
+              <w:left w:type="dxa" w:w="120"/>
+              <w:bottom w:type="dxa" w:w="100"/>
+              <w:right w:type="dxa" w:w="120"/>
+            </w:tcMar>
+          </w:tcPr>
+          <w:p>
+            <w:r>
               <w:t xml:space="preserve">RF03</w:t>
             </w:r>
           </w:p>
         </w:tc>
         <w:tc>
           <w:tcPr>
-            <w:tcW w:type="dxa" w:w="4700"/>
-          </w:tcPr>
-          <w:p>
-            <w:r>
-              <w:rPr>
-                <w:sz w:val="18"/>
-                <w:szCs w:val="18"/>
-              </w:rPr>
+            <w:tcW w:type="dxa" w:w="4200"/>
+            <w:tcMar>
+              <w:top w:type="dxa" w:w="100"/>
+              <w:left w:type="dxa" w:w="120"/>
+              <w:bottom w:type="dxa" w:w="100"/>
+              <w:right w:type="dxa" w:w="120"/>
+            </w:tcMar>
+          </w:tcPr>
+          <w:p>
+            <w:r>
               <w:t xml:space="preserve">O sistema deve permitir ao Garçom registrar os itens do pedido associados à comanda aberta, com lista de pendências (itens ainda não entregues) visível.</w:t>
             </w:r>
           </w:p>
         </w:tc>
         <w:tc>
           <w:tcPr>
-            <w:tcW w:type="dxa" w:w="1560"/>
-          </w:tcPr>
-          <w:p>
-            <w:r>
-              <w:rPr>
-                <w:sz w:val="18"/>
-                <w:szCs w:val="18"/>
-              </w:rPr>
+            <w:tcW w:type="dxa" w:w="1400"/>
+            <w:tcMar>
+              <w:top w:type="dxa" w:w="100"/>
+              <w:left w:type="dxa" w:w="120"/>
+              <w:bottom w:type="dxa" w:w="100"/>
+              <w:right w:type="dxa" w:w="120"/>
+            </w:tcMar>
+          </w:tcPr>
+          <w:p>
+            <w:r>
               <w:t xml:space="preserve">Garçom</w:t>
             </w:r>
           </w:p>
         </w:tc>
         <w:tc>
           <w:tcPr>
-            <w:tcW w:type="dxa" w:w="2400"/>
-          </w:tcPr>
-          <w:p>
-            <w:r>
-              <w:rPr>
-                <w:sz w:val="18"/>
-                <w:szCs w:val="18"/>
-              </w:rPr>
+            <w:tcW w:type="dxa" w:w="3200"/>
+            <w:tcMar>
+              <w:top w:type="dxa" w:w="100"/>
+              <w:left w:type="dxa" w:w="120"/>
+              <w:bottom w:type="dxa" w:w="100"/>
+              <w:right w:type="dxa" w:w="120"/>
+            </w:tcMar>
+          </w:tcPr>
+          <w:p>
+            <w:r>
               <w:t xml:space="preserve">Núcleo do módulo de comandas + refinamento da entrevista Cocobambu (achado espontâneo sobre itens esquecidos, ex.: água).</w:t>
             </w:r>
           </w:p>
@@ -420,55 +450,63 @@
         <w:tc>
           <w:tcPr>
             <w:tcW w:type="dxa" w:w="700"/>
-          </w:tcPr>
-          <w:p>
-            <w:r>
-              <w:rPr>
-                <w:sz w:val="18"/>
-                <w:szCs w:val="18"/>
-              </w:rPr>
+            <w:tcMar>
+              <w:top w:type="dxa" w:w="100"/>
+              <w:left w:type="dxa" w:w="120"/>
+              <w:bottom w:type="dxa" w:w="100"/>
+              <w:right w:type="dxa" w:w="120"/>
+            </w:tcMar>
+          </w:tcPr>
+          <w:p>
+            <w:r>
               <w:t xml:space="preserve">RF04</w:t>
             </w:r>
           </w:p>
         </w:tc>
         <w:tc>
           <w:tcPr>
-            <w:tcW w:type="dxa" w:w="4700"/>
-          </w:tcPr>
-          <w:p>
-            <w:r>
-              <w:rPr>
-                <w:sz w:val="18"/>
-                <w:szCs w:val="18"/>
-              </w:rPr>
+            <w:tcW w:type="dxa" w:w="4200"/>
+            <w:tcMar>
+              <w:top w:type="dxa" w:w="100"/>
+              <w:left w:type="dxa" w:w="120"/>
+              <w:bottom w:type="dxa" w:w="100"/>
+              <w:right w:type="dxa" w:w="120"/>
+            </w:tcMar>
+          </w:tcPr>
+          <w:p>
+            <w:r>
               <w:t xml:space="preserve">O sistema deve permitir ao Garçom fechar a comanda, calculando o valor total com taxa de serviço.</w:t>
             </w:r>
           </w:p>
         </w:tc>
         <w:tc>
           <w:tcPr>
-            <w:tcW w:type="dxa" w:w="1560"/>
-          </w:tcPr>
-          <w:p>
-            <w:r>
-              <w:rPr>
-                <w:sz w:val="18"/>
-                <w:szCs w:val="18"/>
-              </w:rPr>
+            <w:tcW w:type="dxa" w:w="1400"/>
+            <w:tcMar>
+              <w:top w:type="dxa" w:w="100"/>
+              <w:left w:type="dxa" w:w="120"/>
+              <w:bottom w:type="dxa" w:w="100"/>
+              <w:right w:type="dxa" w:w="120"/>
+            </w:tcMar>
+          </w:tcPr>
+          <w:p>
+            <w:r>
               <w:t xml:space="preserve">Garçom</w:t>
             </w:r>
           </w:p>
         </w:tc>
         <w:tc>
           <w:tcPr>
-            <w:tcW w:type="dxa" w:w="2400"/>
-          </w:tcPr>
-          <w:p>
-            <w:r>
-              <w:rPr>
-                <w:sz w:val="18"/>
-                <w:szCs w:val="18"/>
-              </w:rPr>
+            <w:tcW w:type="dxa" w:w="3200"/>
+            <w:tcMar>
+              <w:top w:type="dxa" w:w="100"/>
+              <w:left w:type="dxa" w:w="120"/>
+              <w:bottom w:type="dxa" w:w="100"/>
+              <w:right w:type="dxa" w:w="120"/>
+            </w:tcMar>
+          </w:tcPr>
+          <w:p>
+            <w:r>
               <w:t xml:space="preserve">Núcleo do módulo de comandas — adicional aprovado.</w:t>
             </w:r>
           </w:p>
@@ -478,55 +516,63 @@
         <w:tc>
           <w:tcPr>
             <w:tcW w:type="dxa" w:w="700"/>
-          </w:tcPr>
-          <w:p>
-            <w:r>
-              <w:rPr>
-                <w:sz w:val="18"/>
-                <w:szCs w:val="18"/>
-              </w:rPr>
+            <w:tcMar>
+              <w:top w:type="dxa" w:w="100"/>
+              <w:left w:type="dxa" w:w="120"/>
+              <w:bottom w:type="dxa" w:w="100"/>
+              <w:right w:type="dxa" w:w="120"/>
+            </w:tcMar>
+          </w:tcPr>
+          <w:p>
+            <w:r>
               <w:t xml:space="preserve">RF05</w:t>
             </w:r>
           </w:p>
         </w:tc>
         <w:tc>
           <w:tcPr>
-            <w:tcW w:type="dxa" w:w="4700"/>
-          </w:tcPr>
-          <w:p>
-            <w:r>
-              <w:rPr>
-                <w:sz w:val="18"/>
-                <w:szCs w:val="18"/>
-              </w:rPr>
+            <w:tcW w:type="dxa" w:w="4200"/>
+            <w:tcMar>
+              <w:top w:type="dxa" w:w="100"/>
+              <w:left w:type="dxa" w:w="120"/>
+              <w:bottom w:type="dxa" w:w="100"/>
+              <w:right w:type="dxa" w:w="120"/>
+            </w:tcMar>
+          </w:tcPr>
+          <w:p>
+            <w:r>
               <w:t xml:space="preserve">O sistema deve permitir ao Cliente consultar, via QR code ou tablet, o cardápio digital com fotos, preço e flags dietéticas, sem função de pedido.</w:t>
             </w:r>
           </w:p>
         </w:tc>
         <w:tc>
           <w:tcPr>
-            <w:tcW w:type="dxa" w:w="1560"/>
-          </w:tcPr>
-          <w:p>
-            <w:r>
-              <w:rPr>
-                <w:sz w:val="18"/>
-                <w:szCs w:val="18"/>
-              </w:rPr>
+            <w:tcW w:type="dxa" w:w="1400"/>
+            <w:tcMar>
+              <w:top w:type="dxa" w:w="100"/>
+              <w:left w:type="dxa" w:w="120"/>
+              <w:bottom w:type="dxa" w:w="100"/>
+              <w:right w:type="dxa" w:w="120"/>
+            </w:tcMar>
+          </w:tcPr>
+          <w:p>
+            <w:r>
               <w:t xml:space="preserve">Cliente (condicional)</w:t>
             </w:r>
           </w:p>
         </w:tc>
         <w:tc>
           <w:tcPr>
-            <w:tcW w:type="dxa" w:w="2400"/>
-          </w:tcPr>
-          <w:p>
-            <w:r>
-              <w:rPr>
-                <w:sz w:val="18"/>
-                <w:szCs w:val="18"/>
-              </w:rPr>
+            <w:tcW w:type="dxa" w:w="3200"/>
+            <w:tcMar>
+              <w:top w:type="dxa" w:w="100"/>
+              <w:left w:type="dxa" w:w="120"/>
+              <w:bottom w:type="dxa" w:w="100"/>
+              <w:right w:type="dxa" w:w="120"/>
+            </w:tcMar>
+          </w:tcPr>
+          <w:p>
+            <w:r>
               <w:t xml:space="preserve">EXTRA — condicionado a tempo. Questionário: 83% dos clientes relatam dificuldade com flags dietéticas.</w:t>
             </w:r>
           </w:p>
@@ -536,55 +582,63 @@
         <w:tc>
           <w:tcPr>
             <w:tcW w:type="dxa" w:w="700"/>
-          </w:tcPr>
-          <w:p>
-            <w:r>
-              <w:rPr>
-                <w:sz w:val="18"/>
-                <w:szCs w:val="18"/>
-              </w:rPr>
+            <w:tcMar>
+              <w:top w:type="dxa" w:w="100"/>
+              <w:left w:type="dxa" w:w="120"/>
+              <w:bottom w:type="dxa" w:w="100"/>
+              <w:right w:type="dxa" w:w="120"/>
+            </w:tcMar>
+          </w:tcPr>
+          <w:p>
+            <w:r>
               <w:t xml:space="preserve">RF06</w:t>
             </w:r>
           </w:p>
         </w:tc>
         <w:tc>
           <w:tcPr>
-            <w:tcW w:type="dxa" w:w="4700"/>
-          </w:tcPr>
-          <w:p>
-            <w:r>
-              <w:rPr>
-                <w:sz w:val="18"/>
-                <w:szCs w:val="18"/>
-              </w:rPr>
+            <w:tcW w:type="dxa" w:w="4200"/>
+            <w:tcMar>
+              <w:top w:type="dxa" w:w="100"/>
+              <w:left w:type="dxa" w:w="120"/>
+              <w:bottom w:type="dxa" w:w="100"/>
+              <w:right w:type="dxa" w:w="120"/>
+            </w:tcMar>
+          </w:tcPr>
+          <w:p>
+            <w:r>
               <w:t xml:space="preserve">O sistema deve calcular uma sugestão de alocação de garçons às mesas/praças com base no algoritmo de programação linear (RN03).</w:t>
             </w:r>
           </w:p>
         </w:tc>
         <w:tc>
           <w:tcPr>
-            <w:tcW w:type="dxa" w:w="1560"/>
-          </w:tcPr>
-          <w:p>
-            <w:r>
-              <w:rPr>
-                <w:sz w:val="18"/>
-                <w:szCs w:val="18"/>
-              </w:rPr>
+            <w:tcW w:type="dxa" w:w="1400"/>
+            <w:tcMar>
+              <w:top w:type="dxa" w:w="100"/>
+              <w:left w:type="dxa" w:w="120"/>
+              <w:bottom w:type="dxa" w:w="100"/>
+              <w:right w:type="dxa" w:w="120"/>
+            </w:tcMar>
+          </w:tcPr>
+          <w:p>
+            <w:r>
               <w:t xml:space="preserve">Sistema / Metre</w:t>
             </w:r>
           </w:p>
         </w:tc>
         <w:tc>
           <w:tcPr>
-            <w:tcW w:type="dxa" w:w="2400"/>
-          </w:tcPr>
-          <w:p>
-            <w:r>
-              <w:rPr>
-                <w:sz w:val="18"/>
-                <w:szCs w:val="18"/>
-              </w:rPr>
+            <w:tcW w:type="dxa" w:w="3200"/>
+            <w:tcMar>
+              <w:top w:type="dxa" w:w="100"/>
+              <w:left w:type="dxa" w:w="120"/>
+              <w:bottom w:type="dxa" w:w="100"/>
+              <w:right w:type="dxa" w:w="120"/>
+            </w:tcMar>
+          </w:tcPr>
+          <w:p>
+            <w:r>
               <w:t xml:space="preserve">Escopo original, bloco de Programação Linear.</w:t>
             </w:r>
           </w:p>
@@ -594,55 +648,63 @@
         <w:tc>
           <w:tcPr>
             <w:tcW w:type="dxa" w:w="700"/>
-          </w:tcPr>
-          <w:p>
-            <w:r>
-              <w:rPr>
-                <w:sz w:val="18"/>
-                <w:szCs w:val="18"/>
-              </w:rPr>
+            <w:tcMar>
+              <w:top w:type="dxa" w:w="100"/>
+              <w:left w:type="dxa" w:w="120"/>
+              <w:bottom w:type="dxa" w:w="100"/>
+              <w:right w:type="dxa" w:w="120"/>
+            </w:tcMar>
+          </w:tcPr>
+          <w:p>
+            <w:r>
               <w:t xml:space="preserve">RF07</w:t>
             </w:r>
           </w:p>
         </w:tc>
         <w:tc>
           <w:tcPr>
-            <w:tcW w:type="dxa" w:w="4700"/>
-          </w:tcPr>
-          <w:p>
-            <w:r>
-              <w:rPr>
-                <w:sz w:val="18"/>
-                <w:szCs w:val="18"/>
-              </w:rPr>
+            <w:tcW w:type="dxa" w:w="4200"/>
+            <w:tcMar>
+              <w:top w:type="dxa" w:w="100"/>
+              <w:left w:type="dxa" w:w="120"/>
+              <w:bottom w:type="dxa" w:w="100"/>
+              <w:right w:type="dxa" w:w="120"/>
+            </w:tcMar>
+          </w:tcPr>
+          <w:p>
+            <w:r>
               <w:t xml:space="preserve">O sistema deve permitir ao Metre visualizar e ajustar manualmente a alocação sugerida antes de confirmá-la.</w:t>
             </w:r>
           </w:p>
         </w:tc>
         <w:tc>
           <w:tcPr>
-            <w:tcW w:type="dxa" w:w="1560"/>
-          </w:tcPr>
-          <w:p>
-            <w:r>
-              <w:rPr>
-                <w:sz w:val="18"/>
-                <w:szCs w:val="18"/>
-              </w:rPr>
+            <w:tcW w:type="dxa" w:w="1400"/>
+            <w:tcMar>
+              <w:top w:type="dxa" w:w="100"/>
+              <w:left w:type="dxa" w:w="120"/>
+              <w:bottom w:type="dxa" w:w="100"/>
+              <w:right w:type="dxa" w:w="120"/>
+            </w:tcMar>
+          </w:tcPr>
+          <w:p>
+            <w:r>
               <w:t xml:space="preserve">Metre</w:t>
             </w:r>
           </w:p>
         </w:tc>
         <w:tc>
           <w:tcPr>
-            <w:tcW w:type="dxa" w:w="2400"/>
-          </w:tcPr>
-          <w:p>
-            <w:r>
-              <w:rPr>
-                <w:sz w:val="18"/>
-                <w:szCs w:val="18"/>
-              </w:rPr>
+            <w:tcW w:type="dxa" w:w="3200"/>
+            <w:tcMar>
+              <w:top w:type="dxa" w:w="100"/>
+              <w:left w:type="dxa" w:w="120"/>
+              <w:bottom w:type="dxa" w:w="100"/>
+              <w:right w:type="dxa" w:w="120"/>
+            </w:tcMar>
+          </w:tcPr>
+          <w:p>
+            <w:r>
               <w:t xml:space="preserve">Mantém decisão humana final; reforçado pela entrevista ("algo que deveria continuar sendo decisão do funcionário").</w:t>
             </w:r>
           </w:p>
@@ -652,55 +714,63 @@
         <w:tc>
           <w:tcPr>
             <w:tcW w:type="dxa" w:w="700"/>
-          </w:tcPr>
-          <w:p>
-            <w:r>
-              <w:rPr>
-                <w:sz w:val="18"/>
-                <w:szCs w:val="18"/>
-              </w:rPr>
+            <w:tcMar>
+              <w:top w:type="dxa" w:w="100"/>
+              <w:left w:type="dxa" w:w="120"/>
+              <w:bottom w:type="dxa" w:w="100"/>
+              <w:right w:type="dxa" w:w="120"/>
+            </w:tcMar>
+          </w:tcPr>
+          <w:p>
+            <w:r>
               <w:t xml:space="preserve">RF08</w:t>
             </w:r>
           </w:p>
         </w:tc>
         <w:tc>
           <w:tcPr>
-            <w:tcW w:type="dxa" w:w="4700"/>
-          </w:tcPr>
-          <w:p>
-            <w:r>
-              <w:rPr>
-                <w:sz w:val="18"/>
-                <w:szCs w:val="18"/>
-              </w:rPr>
+            <w:tcW w:type="dxa" w:w="4200"/>
+            <w:tcMar>
+              <w:top w:type="dxa" w:w="100"/>
+              <w:left w:type="dxa" w:w="120"/>
+              <w:bottom w:type="dxa" w:w="100"/>
+              <w:right w:type="dxa" w:w="120"/>
+            </w:tcMar>
+          </w:tcPr>
+          <w:p>
+            <w:r>
               <w:t xml:space="preserve">O sistema deve registrar o histórico de alocações e faturamento por praça para uso no RN03 e em BI.</w:t>
             </w:r>
           </w:p>
         </w:tc>
         <w:tc>
           <w:tcPr>
-            <w:tcW w:type="dxa" w:w="1560"/>
-          </w:tcPr>
-          <w:p>
-            <w:r>
-              <w:rPr>
-                <w:sz w:val="18"/>
-                <w:szCs w:val="18"/>
-              </w:rPr>
+            <w:tcW w:type="dxa" w:w="1400"/>
+            <w:tcMar>
+              <w:top w:type="dxa" w:w="100"/>
+              <w:left w:type="dxa" w:w="120"/>
+              <w:bottom w:type="dxa" w:w="100"/>
+              <w:right w:type="dxa" w:w="120"/>
+            </w:tcMar>
+          </w:tcPr>
+          <w:p>
+            <w:r>
               <w:t xml:space="preserve">Sistema</w:t>
             </w:r>
           </w:p>
         </w:tc>
         <w:tc>
           <w:tcPr>
-            <w:tcW w:type="dxa" w:w="2400"/>
-          </w:tcPr>
-          <w:p>
-            <w:r>
-              <w:rPr>
-                <w:sz w:val="18"/>
-                <w:szCs w:val="18"/>
-              </w:rPr>
+            <w:tcW w:type="dxa" w:w="3200"/>
+            <w:tcMar>
+              <w:top w:type="dxa" w:w="100"/>
+              <w:left w:type="dxa" w:w="120"/>
+              <w:bottom w:type="dxa" w:w="100"/>
+              <w:right w:type="dxa" w:w="120"/>
+            </w:tcMar>
+          </w:tcPr>
+          <w:p>
+            <w:r>
               <w:t xml:space="preserve">Escopo original + entrevista: praças têm potencial de faturamento estruturalmente diferente (ex.: mesa de casal vs. mesa família).</w:t>
             </w:r>
           </w:p>
@@ -710,55 +780,63 @@
         <w:tc>
           <w:tcPr>
             <w:tcW w:type="dxa" w:w="700"/>
-          </w:tcPr>
-          <w:p>
-            <w:r>
-              <w:rPr>
-                <w:sz w:val="18"/>
-                <w:szCs w:val="18"/>
-              </w:rPr>
+            <w:tcMar>
+              <w:top w:type="dxa" w:w="100"/>
+              <w:left w:type="dxa" w:w="120"/>
+              <w:bottom w:type="dxa" w:w="100"/>
+              <w:right w:type="dxa" w:w="120"/>
+            </w:tcMar>
+          </w:tcPr>
+          <w:p>
+            <w:r>
               <w:t xml:space="preserve">RF09</w:t>
             </w:r>
           </w:p>
         </w:tc>
         <w:tc>
           <w:tcPr>
-            <w:tcW w:type="dxa" w:w="4700"/>
-          </w:tcPr>
-          <w:p>
-            <w:r>
-              <w:rPr>
-                <w:sz w:val="18"/>
-                <w:szCs w:val="18"/>
-              </w:rPr>
+            <w:tcW w:type="dxa" w:w="4200"/>
+            <w:tcMar>
+              <w:top w:type="dxa" w:w="100"/>
+              <w:left w:type="dxa" w:w="120"/>
+              <w:bottom w:type="dxa" w:w="100"/>
+              <w:right w:type="dxa" w:w="120"/>
+            </w:tcMar>
+          </w:tcPr>
+          <w:p>
+            <w:r>
               <w:t xml:space="preserve">O sistema deve sugerir combinações de pratos ao Garçom com base em clusterização e regras de associação, calibradas por suporte/confiança mínimos.</w:t>
             </w:r>
           </w:p>
         </w:tc>
         <w:tc>
           <w:tcPr>
-            <w:tcW w:type="dxa" w:w="1560"/>
-          </w:tcPr>
-          <w:p>
-            <w:r>
-              <w:rPr>
-                <w:sz w:val="18"/>
-                <w:szCs w:val="18"/>
-              </w:rPr>
+            <w:tcW w:type="dxa" w:w="1400"/>
+            <w:tcMar>
+              <w:top w:type="dxa" w:w="100"/>
+              <w:left w:type="dxa" w:w="120"/>
+              <w:bottom w:type="dxa" w:w="100"/>
+              <w:right w:type="dxa" w:w="120"/>
+            </w:tcMar>
+          </w:tcPr>
+          <w:p>
+            <w:r>
               <w:t xml:space="preserve">Garçom</w:t>
             </w:r>
           </w:p>
         </w:tc>
         <w:tc>
           <w:tcPr>
-            <w:tcW w:type="dxa" w:w="2400"/>
-          </w:tcPr>
-          <w:p>
-            <w:r>
-              <w:rPr>
-                <w:sz w:val="18"/>
-                <w:szCs w:val="18"/>
-              </w:rPr>
+            <w:tcW w:type="dxa" w:w="3200"/>
+            <w:tcMar>
+              <w:top w:type="dxa" w:w="100"/>
+              <w:left w:type="dxa" w:w="120"/>
+              <w:bottom w:type="dxa" w:w="100"/>
+              <w:right w:type="dxa" w:w="120"/>
+            </w:tcMar>
+          </w:tcPr>
+          <w:p>
+            <w:r>
               <w:t xml:space="preserve">Escopo original, bloco de Ciência de Dados.</w:t>
             </w:r>
           </w:p>
@@ -768,55 +846,63 @@
         <w:tc>
           <w:tcPr>
             <w:tcW w:type="dxa" w:w="700"/>
-          </w:tcPr>
-          <w:p>
-            <w:r>
-              <w:rPr>
-                <w:sz w:val="18"/>
-                <w:szCs w:val="18"/>
-              </w:rPr>
+            <w:tcMar>
+              <w:top w:type="dxa" w:w="100"/>
+              <w:left w:type="dxa" w:w="120"/>
+              <w:bottom w:type="dxa" w:w="100"/>
+              <w:right w:type="dxa" w:w="120"/>
+            </w:tcMar>
+          </w:tcPr>
+          <w:p>
+            <w:r>
               <w:t xml:space="preserve">RF10</w:t>
             </w:r>
           </w:p>
         </w:tc>
         <w:tc>
           <w:tcPr>
-            <w:tcW w:type="dxa" w:w="4700"/>
-          </w:tcPr>
-          <w:p>
-            <w:r>
-              <w:rPr>
-                <w:sz w:val="18"/>
-                <w:szCs w:val="18"/>
-              </w:rPr>
+            <w:tcW w:type="dxa" w:w="4200"/>
+            <w:tcMar>
+              <w:top w:type="dxa" w:w="100"/>
+              <w:left w:type="dxa" w:w="120"/>
+              <w:bottom w:type="dxa" w:w="100"/>
+              <w:right w:type="dxa" w:w="120"/>
+            </w:tcMar>
+          </w:tcPr>
+          <w:p>
+            <w:r>
               <w:t xml:space="preserve">O sistema deve exibir ao Gerente relatórios agregados de faturamento por praça e por garçom, com os KPIs definidos na seção 3.</w:t>
             </w:r>
           </w:p>
         </w:tc>
         <w:tc>
           <w:tcPr>
-            <w:tcW w:type="dxa" w:w="1560"/>
-          </w:tcPr>
-          <w:p>
-            <w:r>
-              <w:rPr>
-                <w:sz w:val="18"/>
-                <w:szCs w:val="18"/>
-              </w:rPr>
+            <w:tcW w:type="dxa" w:w="1400"/>
+            <w:tcMar>
+              <w:top w:type="dxa" w:w="100"/>
+              <w:left w:type="dxa" w:w="120"/>
+              <w:bottom w:type="dxa" w:w="100"/>
+              <w:right w:type="dxa" w:w="120"/>
+            </w:tcMar>
+          </w:tcPr>
+          <w:p>
+            <w:r>
               <w:t xml:space="preserve">Gerente</w:t>
             </w:r>
           </w:p>
         </w:tc>
         <w:tc>
           <w:tcPr>
-            <w:tcW w:type="dxa" w:w="2400"/>
-          </w:tcPr>
-          <w:p>
-            <w:r>
-              <w:rPr>
-                <w:sz w:val="18"/>
-                <w:szCs w:val="18"/>
-              </w:rPr>
+            <w:tcW w:type="dxa" w:w="3200"/>
+            <w:tcMar>
+              <w:top w:type="dxa" w:w="100"/>
+              <w:left w:type="dxa" w:w="120"/>
+              <w:bottom w:type="dxa" w:w="100"/>
+              <w:right w:type="dxa" w:w="120"/>
+            </w:tcMar>
+          </w:tcPr>
+          <w:p>
+            <w:r>
               <w:t xml:space="preserve">Escopo original, bloco de BI.</w:t>
             </w:r>
           </w:p>
@@ -826,55 +912,63 @@
         <w:tc>
           <w:tcPr>
             <w:tcW w:type="dxa" w:w="700"/>
-          </w:tcPr>
-          <w:p>
-            <w:r>
-              <w:rPr>
-                <w:sz w:val="18"/>
-                <w:szCs w:val="18"/>
-              </w:rPr>
+            <w:tcMar>
+              <w:top w:type="dxa" w:w="100"/>
+              <w:left w:type="dxa" w:w="120"/>
+              <w:bottom w:type="dxa" w:w="100"/>
+              <w:right w:type="dxa" w:w="120"/>
+            </w:tcMar>
+          </w:tcPr>
+          <w:p>
+            <w:r>
               <w:t xml:space="preserve">RF11</w:t>
             </w:r>
           </w:p>
         </w:tc>
         <w:tc>
           <w:tcPr>
-            <w:tcW w:type="dxa" w:w="4700"/>
-          </w:tcPr>
-          <w:p>
-            <w:r>
-              <w:rPr>
-                <w:sz w:val="18"/>
-                <w:szCs w:val="18"/>
-              </w:rPr>
+            <w:tcW w:type="dxa" w:w="4200"/>
+            <w:tcMar>
+              <w:top w:type="dxa" w:w="100"/>
+              <w:left w:type="dxa" w:w="120"/>
+              <w:bottom w:type="dxa" w:w="100"/>
+              <w:right w:type="dxa" w:w="120"/>
+            </w:tcMar>
+          </w:tcPr>
+          <w:p>
+            <w:r>
               <w:t xml:space="preserve">O sistema deve exibir um índice composto de desempenho dos garçons (não apenas venda) para ranking/gamificação.</w:t>
             </w:r>
           </w:p>
         </w:tc>
         <w:tc>
           <w:tcPr>
-            <w:tcW w:type="dxa" w:w="1560"/>
-          </w:tcPr>
-          <w:p>
-            <w:r>
-              <w:rPr>
-                <w:sz w:val="18"/>
-                <w:szCs w:val="18"/>
-              </w:rPr>
+            <w:tcW w:type="dxa" w:w="1400"/>
+            <w:tcMar>
+              <w:top w:type="dxa" w:w="100"/>
+              <w:left w:type="dxa" w:w="120"/>
+              <w:bottom w:type="dxa" w:w="100"/>
+              <w:right w:type="dxa" w:w="120"/>
+            </w:tcMar>
+          </w:tcPr>
+          <w:p>
+            <w:r>
               <w:t xml:space="preserve">Gerente, Garçom</w:t>
             </w:r>
           </w:p>
         </w:tc>
         <w:tc>
           <w:tcPr>
-            <w:tcW w:type="dxa" w:w="2400"/>
-          </w:tcPr>
-          <w:p>
-            <w:r>
-              <w:rPr>
-                <w:sz w:val="18"/>
-                <w:szCs w:val="18"/>
-              </w:rPr>
+            <w:tcW w:type="dxa" w:w="3200"/>
+            <w:tcMar>
+              <w:top w:type="dxa" w:w="100"/>
+              <w:left w:type="dxa" w:w="120"/>
+              <w:bottom w:type="dxa" w:w="100"/>
+              <w:right w:type="dxa" w:w="120"/>
+            </w:tcMar>
+          </w:tcPr>
+          <w:p>
+            <w:r>
               <w:t xml:space="preserve">Refinado pela entrevista: "podia ter outras métricas também, não só venda".</w:t>
             </w:r>
           </w:p>
@@ -884,55 +978,63 @@
         <w:tc>
           <w:tcPr>
             <w:tcW w:type="dxa" w:w="700"/>
-          </w:tcPr>
-          <w:p>
-            <w:r>
-              <w:rPr>
-                <w:sz w:val="18"/>
-                <w:szCs w:val="18"/>
-              </w:rPr>
+            <w:tcMar>
+              <w:top w:type="dxa" w:w="100"/>
+              <w:left w:type="dxa" w:w="120"/>
+              <w:bottom w:type="dxa" w:w="100"/>
+              <w:right w:type="dxa" w:w="120"/>
+            </w:tcMar>
+          </w:tcPr>
+          <w:p>
+            <w:r>
               <w:t xml:space="preserve">RF12</w:t>
             </w:r>
           </w:p>
         </w:tc>
         <w:tc>
           <w:tcPr>
-            <w:tcW w:type="dxa" w:w="4700"/>
-          </w:tcPr>
-          <w:p>
-            <w:r>
-              <w:rPr>
-                <w:sz w:val="18"/>
-                <w:szCs w:val="18"/>
-              </w:rPr>
+            <w:tcW w:type="dxa" w:w="4200"/>
+            <w:tcMar>
+              <w:top w:type="dxa" w:w="100"/>
+              <w:left w:type="dxa" w:w="120"/>
+              <w:bottom w:type="dxa" w:w="100"/>
+              <w:right w:type="dxa" w:w="120"/>
+            </w:tcMar>
+          </w:tcPr>
+          <w:p>
+            <w:r>
               <w:t xml:space="preserve">O sistema deve permitir ao Cliente solicitar a exclusão do seu histórico de pedidos a qualquer momento.</w:t>
             </w:r>
           </w:p>
         </w:tc>
         <w:tc>
           <w:tcPr>
-            <w:tcW w:type="dxa" w:w="1560"/>
-          </w:tcPr>
-          <w:p>
-            <w:r>
-              <w:rPr>
-                <w:sz w:val="18"/>
-                <w:szCs w:val="18"/>
-              </w:rPr>
+            <w:tcW w:type="dxa" w:w="1400"/>
+            <w:tcMar>
+              <w:top w:type="dxa" w:w="100"/>
+              <w:left w:type="dxa" w:w="120"/>
+              <w:bottom w:type="dxa" w:w="100"/>
+              <w:right w:type="dxa" w:w="120"/>
+            </w:tcMar>
+          </w:tcPr>
+          <w:p>
+            <w:r>
               <w:t xml:space="preserve">Cliente</w:t>
             </w:r>
           </w:p>
         </w:tc>
         <w:tc>
           <w:tcPr>
-            <w:tcW w:type="dxa" w:w="2400"/>
-          </w:tcPr>
-          <w:p>
-            <w:r>
-              <w:rPr>
-                <w:sz w:val="18"/>
-                <w:szCs w:val="18"/>
-              </w:rPr>
+            <w:tcW w:type="dxa" w:w="3200"/>
+            <w:tcMar>
+              <w:top w:type="dxa" w:w="100"/>
+              <w:left w:type="dxa" w:w="120"/>
+              <w:bottom w:type="dxa" w:w="100"/>
+              <w:right w:type="dxa" w:w="120"/>
+            </w:tcMar>
+          </w:tcPr>
+          <w:p>
+            <w:r>
               <w:t xml:space="preserve">Direito ao esquecimento (LGPD, Art. 6º).</w:t>
             </w:r>
           </w:p>
@@ -942,55 +1044,63 @@
         <w:tc>
           <w:tcPr>
             <w:tcW w:type="dxa" w:w="700"/>
-          </w:tcPr>
-          <w:p>
-            <w:r>
-              <w:rPr>
-                <w:sz w:val="18"/>
-                <w:szCs w:val="18"/>
-              </w:rPr>
+            <w:tcMar>
+              <w:top w:type="dxa" w:w="100"/>
+              <w:left w:type="dxa" w:w="120"/>
+              <w:bottom w:type="dxa" w:w="100"/>
+              <w:right w:type="dxa" w:w="120"/>
+            </w:tcMar>
+          </w:tcPr>
+          <w:p>
+            <w:r>
               <w:t xml:space="preserve">RF13</w:t>
             </w:r>
           </w:p>
         </w:tc>
         <w:tc>
           <w:tcPr>
-            <w:tcW w:type="dxa" w:w="4700"/>
-          </w:tcPr>
-          <w:p>
-            <w:r>
-              <w:rPr>
-                <w:sz w:val="18"/>
-                <w:szCs w:val="18"/>
-              </w:rPr>
+            <w:tcW w:type="dxa" w:w="4200"/>
+            <w:tcMar>
+              <w:top w:type="dxa" w:w="100"/>
+              <w:left w:type="dxa" w:w="120"/>
+              <w:bottom w:type="dxa" w:w="100"/>
+              <w:right w:type="dxa" w:w="120"/>
+            </w:tcMar>
+          </w:tcPr>
+          <w:p>
+            <w:r>
               <w:t xml:space="preserve">O sistema deve permitir ao Cliente consultar sua comanda em tempo real (itens já lançados e valor parcial).</w:t>
             </w:r>
           </w:p>
         </w:tc>
         <w:tc>
           <w:tcPr>
-            <w:tcW w:type="dxa" w:w="1560"/>
-          </w:tcPr>
-          <w:p>
-            <w:r>
-              <w:rPr>
-                <w:sz w:val="18"/>
-                <w:szCs w:val="18"/>
-              </w:rPr>
+            <w:tcW w:type="dxa" w:w="1400"/>
+            <w:tcMar>
+              <w:top w:type="dxa" w:w="100"/>
+              <w:left w:type="dxa" w:w="120"/>
+              <w:bottom w:type="dxa" w:w="100"/>
+              <w:right w:type="dxa" w:w="120"/>
+            </w:tcMar>
+          </w:tcPr>
+          <w:p>
+            <w:r>
               <w:t xml:space="preserve">Cliente (condicional)</w:t>
             </w:r>
           </w:p>
         </w:tc>
         <w:tc>
           <w:tcPr>
-            <w:tcW w:type="dxa" w:w="2400"/>
-          </w:tcPr>
-          <w:p>
-            <w:r>
-              <w:rPr>
-                <w:sz w:val="18"/>
-                <w:szCs w:val="18"/>
-              </w:rPr>
+            <w:tcW w:type="dxa" w:w="3200"/>
+            <w:tcMar>
+              <w:top w:type="dxa" w:w="100"/>
+              <w:left w:type="dxa" w:w="120"/>
+              <w:bottom w:type="dxa" w:w="100"/>
+              <w:right w:type="dxa" w:w="120"/>
+            </w:tcMar>
+          </w:tcPr>
+          <w:p>
+            <w:r>
               <w:t xml:space="preserve">EXTRA — condicionado a tempo. Achado da entrevista Cocobambu: reduz disputa de conta ao final do atendimento.</w:t>
             </w:r>
           </w:p>
@@ -1000,7 +1110,7 @@
     <w:p>
       <w:pPr>
         <w:pStyle w:val="Heading1"/>
-        <w:spacing w:after="160" w:before="320"/>
+        <w:spacing w:after="150" w:before="300"/>
       </w:pPr>
       <w:r>
         <w:t xml:space="preserve">3. KPIs e critérios analíticos (proposta da dupla — pendente de validação final)</w:t>
@@ -1008,7 +1118,7 @@
     </w:p>
     <w:p>
       <w:pPr>
-        <w:spacing w:after="160"/>
+        <w:spacing w:after="200"/>
       </w:pPr>
       <w:r>
         <w:t xml:space="preserve">Esta seção formaliza os critérios que estavam listados como pendências no documento anterior (seção 5, versão 17/08/2026). São propostas construídas a partir da entrevista com o garçom do Cocobambu e do questionário — precisam de validação entre a dupla antes de serem tratadas como fechadas, e do orientador antes de constarem como definitivas no TG.</w:t>
@@ -1016,8 +1126,8 @@
     </w:p>
     <w:p>
       <w:pPr>
-        <w:pStyle w:val="Heading2"/>
-        <w:spacing w:after="120" w:before="240"/>
+        <w:pStyle w:val="Heading3"/>
+        <w:spacing w:after="120" w:before="250"/>
       </w:pPr>
       <w:r>
         <w:t xml:space="preserve">3.1 Critério de rotação/alocação de garçons (RN03)</w:t>
@@ -1025,7 +1135,7 @@
     </w:p>
     <w:p>
       <w:pPr>
-        <w:spacing w:after="160"/>
+        <w:spacing w:after="200"/>
       </w:pPr>
       <w:r>
         <w:t xml:space="preserve">Proposta: equilibrar o faturamento acumulado por garçom ao longo de um período de referência (ex.: semana), ponderando a alocação pelo faturamento médio histórico de cada praça — garçons alocados repetidamente em praças de menor potencial ganham prioridade em praças de maior potencial nas rodadas seguintes, e vice-versa.</w:t>
@@ -1033,7 +1143,7 @@
     </w:p>
     <w:p>
       <w:pPr>
-        <w:spacing w:after="160"/>
+        <w:spacing w:after="200"/>
       </w:pPr>
       <w:r>
         <w:t xml:space="preserve">Racional: descarta as hipóteses "minimizar tempo de espera" e "maximizar gorjeta total" por não terem aparecido como dor espontânea nem na entrevista nem no questionário; a dor relatada foi especificamente desigualdade percebida entre praças.</w:t>
@@ -1041,8 +1151,23 @@
     </w:p>
     <w:p>
       <w:pPr>
-        <w:pStyle w:val="Heading2"/>
-        <w:spacing w:after="120" w:before="240"/>
+        <w:spacing w:after="200"/>
+      </w:pPr>
+      <w:r>
+        <w:rPr>
+          <w:b/>
+          <w:bCs/>
+        </w:rPr>
+        <w:t xml:space="preserve">Status (22/08/2026, issue #6): </w:t>
+      </w:r>
+      <w:r>
+        <w:t xml:space="preserve">a estrutura da função objetivo acima está fechada. Seguem pendentes, como issue própria (#26): a validação formal desta abordagem com o orientador, e a calibração numérica dos pesos (quanto o histórico da praça pesa vs. o acumulado do garçom), que depende de dado real ou simulado ainda não disponível.</w:t>
+      </w:r>
+    </w:p>
+    <w:p>
+      <w:pPr>
+        <w:pStyle w:val="Heading3"/>
+        <w:spacing w:after="120" w:before="250"/>
       </w:pPr>
       <w:r>
         <w:t xml:space="preserve">3.2 KPIs de BI (RF10) e índice de ranking (RF11)</w:t>
@@ -1053,9 +1178,9 @@
         <w:pStyle w:val="ListParagraph"/>
         <w:numPr>
           <w:ilvl w:val="0"/>
-          <w:numId w:val="2"/>
+          <w:numId w:val="1"/>
         </w:numPr>
-        <w:spacing w:after="80"/>
+        <w:spacing w:after="150"/>
       </w:pPr>
       <w:r>
         <w:t xml:space="preserve">Faturamento total e médio por garçom, por período.</w:t>
@@ -1066,9 +1191,9 @@
         <w:pStyle w:val="ListParagraph"/>
         <w:numPr>
           <w:ilvl w:val="0"/>
-          <w:numId w:val="2"/>
+          <w:numId w:val="1"/>
         </w:numPr>
-        <w:spacing w:after="80"/>
+        <w:spacing w:after="150"/>
       </w:pPr>
       <w:r>
         <w:t xml:space="preserve">Faturamento médio histórico por praça (alimenta o RN03).</w:t>
@@ -1079,9 +1204,9 @@
         <w:pStyle w:val="ListParagraph"/>
         <w:numPr>
           <w:ilvl w:val="0"/>
-          <w:numId w:val="2"/>
+          <w:numId w:val="1"/>
         </w:numPr>
-        <w:spacing w:after="80"/>
+        <w:spacing w:after="150"/>
       </w:pPr>
       <w:r>
         <w:t xml:space="preserve">Ticket médio por mesa atendida.</w:t>
@@ -1092,9 +1217,9 @@
         <w:pStyle w:val="ListParagraph"/>
         <w:numPr>
           <w:ilvl w:val="0"/>
-          <w:numId w:val="2"/>
+          <w:numId w:val="1"/>
         </w:numPr>
-        <w:spacing w:after="80"/>
+        <w:spacing w:after="150"/>
       </w:pPr>
       <w:r>
         <w:t xml:space="preserve">Tempo médio de atendimento (abertura → fechamento da comanda).</w:t>
@@ -1105,9 +1230,9 @@
         <w:pStyle w:val="ListParagraph"/>
         <w:numPr>
           <w:ilvl w:val="0"/>
-          <w:numId w:val="2"/>
+          <w:numId w:val="1"/>
         </w:numPr>
-        <w:spacing w:after="80"/>
+        <w:spacing w:after="150"/>
       </w:pPr>
       <w:r>
         <w:t xml:space="preserve">Índice composto de desempenho: combina faturamento + nº de mesas atendidas (evita expor só a métrica de venda pura, conforme sinalizado na entrevista).</w:t>
@@ -1115,8 +1240,8 @@
     </w:p>
     <w:p>
       <w:pPr>
-        <w:pStyle w:val="Heading2"/>
-        <w:spacing w:after="120" w:before="240"/>
+        <w:pStyle w:val="Heading3"/>
+        <w:spacing w:after="120" w:before="250"/>
       </w:pPr>
       <w:r>
         <w:t xml:space="preserve">3.3 Critério de recomendação de pratos (RF09)</w:t>
@@ -1127,9 +1252,9 @@
         <w:pStyle w:val="ListParagraph"/>
         <w:numPr>
           <w:ilvl w:val="0"/>
-          <w:numId w:val="2"/>
+          <w:numId w:val="1"/>
         </w:numPr>
-        <w:spacing w:after="80"/>
+        <w:spacing w:after="150"/>
       </w:pPr>
       <w:r>
         <w:t xml:space="preserve">Regras de associação: limiares mínimos de suporte e confiança — valores exatos a calibrar quando houver volume de dado real ou simulado suficiente; não é possível fechar um número sem essa base.</w:t>
@@ -1140,9 +1265,9 @@
         <w:pStyle w:val="ListParagraph"/>
         <w:numPr>
           <w:ilvl w:val="0"/>
-          <w:numId w:val="2"/>
+          <w:numId w:val="1"/>
         </w:numPr>
-        <w:spacing w:after="80"/>
+        <w:spacing w:after="150"/>
       </w:pPr>
       <w:r>
         <w:t xml:space="preserve">Clusterização por padrão de consumo observável (nunca atributo sensível — decisão já fechada, RN05); número de clusters a definir experimentalmente (ex.: método do cotovelo).</w:t>
@@ -1150,17 +1275,12 @@
     </w:p>
     <w:p>
       <w:pPr>
-        <w:pBdr>
-          <w:left w:val="single" w:color="999999" w:sz="12" w:space="8"/>
-        </w:pBdr>
-        <w:spacing w:after="200" w:before="120"/>
-        <w:ind w:left="200"/>
+        <w:spacing w:after="200"/>
       </w:pPr>
       <w:r>
         <w:rPr>
           <w:i/>
           <w:iCs/>
-          <w:color w:val="555555"/>
         </w:rPr>
         <w:t xml:space="preserve">Nenhum valor numérico definitivo (limiar de suporte/confiança, número de clusters) pode ser fixado antes de haver dado real ou simulado suficiente para calibração — registrar isso explicitamente na metodologia do TG.</w:t>
       </w:r>
@@ -1168,7 +1288,7 @@
     <w:p>
       <w:pPr>
         <w:pStyle w:val="Heading1"/>
-        <w:spacing w:after="160" w:before="320"/>
+        <w:spacing w:after="150" w:before="300"/>
       </w:pPr>
       <w:r>
         <w:t xml:space="preserve">4. Requisitos Não Funcionais (RNF)</w:t>
@@ -1176,7 +1296,7 @@
     </w:p>
     <w:tbl>
       <w:tblPr>
-        <w:tblW w:type="dxa" w:w="9360"/>
+        <w:tblW w:type="dxa" w:w="9500"/>
         <w:tblBorders>
           <w:top w:val="single" w:color="auto" w:sz="4"/>
           <w:left w:val="single" w:color="auto" w:sz="4"/>
@@ -1188,9 +1308,9 @@
       </w:tblPr>
       <w:tblGrid>
         <w:gridCol w:w="700"/>
-        <w:gridCol w:w="4700"/>
-        <w:gridCol w:w="1560"/>
-        <w:gridCol w:w="2400"/>
+        <w:gridCol w:w="4300"/>
+        <w:gridCol w:w="1600"/>
+        <w:gridCol w:w="2900"/>
       </w:tblGrid>
       <w:tr>
         <w:trPr>
@@ -1199,16 +1319,19 @@
         <w:tc>
           <w:tcPr>
             <w:tcW w:type="dxa" w:w="700"/>
-            <w:shd w:fill="2F5233" w:val="clear"/>
+            <w:shd w:fill="D9E2F3" w:val="clear"/>
+            <w:tcMar>
+              <w:top w:type="dxa" w:w="100"/>
+              <w:left w:type="dxa" w:w="120"/>
+              <w:bottom w:type="dxa" w:w="100"/>
+              <w:right w:type="dxa" w:w="120"/>
+            </w:tcMar>
           </w:tcPr>
           <w:p>
             <w:r>
               <w:rPr>
                 <w:b/>
                 <w:bCs/>
-                <w:color w:val="FFFFFF"/>
-                <w:sz w:val="18"/>
-                <w:szCs w:val="18"/>
               </w:rPr>
               <w:t xml:space="preserve">ID</w:t>
             </w:r>
@@ -1216,17 +1339,20 @@
         </w:tc>
         <w:tc>
           <w:tcPr>
-            <w:tcW w:type="dxa" w:w="4700"/>
-            <w:shd w:fill="2F5233" w:val="clear"/>
+            <w:tcW w:type="dxa" w:w="4300"/>
+            <w:shd w:fill="D9E2F3" w:val="clear"/>
+            <w:tcMar>
+              <w:top w:type="dxa" w:w="100"/>
+              <w:left w:type="dxa" w:w="120"/>
+              <w:bottom w:type="dxa" w:w="100"/>
+              <w:right w:type="dxa" w:w="120"/>
+            </w:tcMar>
           </w:tcPr>
           <w:p>
             <w:r>
               <w:rPr>
                 <w:b/>
                 <w:bCs/>
-                <w:color w:val="FFFFFF"/>
-                <w:sz w:val="18"/>
-                <w:szCs w:val="18"/>
               </w:rPr>
               <w:t xml:space="preserve">Descrição</w:t>
             </w:r>
@@ -1234,17 +1360,20 @@
         </w:tc>
         <w:tc>
           <w:tcPr>
-            <w:tcW w:type="dxa" w:w="1560"/>
-            <w:shd w:fill="2F5233" w:val="clear"/>
+            <w:tcW w:type="dxa" w:w="1600"/>
+            <w:shd w:fill="D9E2F3" w:val="clear"/>
+            <w:tcMar>
+              <w:top w:type="dxa" w:w="100"/>
+              <w:left w:type="dxa" w:w="120"/>
+              <w:bottom w:type="dxa" w:w="100"/>
+              <w:right w:type="dxa" w:w="120"/>
+            </w:tcMar>
           </w:tcPr>
           <w:p>
             <w:r>
               <w:rPr>
                 <w:b/>
                 <w:bCs/>
-                <w:color w:val="FFFFFF"/>
-                <w:sz w:val="18"/>
-                <w:szCs w:val="18"/>
               </w:rPr>
               <w:t xml:space="preserve">Categoria</w:t>
             </w:r>
@@ -1252,17 +1381,20 @@
         </w:tc>
         <w:tc>
           <w:tcPr>
-            <w:tcW w:type="dxa" w:w="2400"/>
-            <w:shd w:fill="2F5233" w:val="clear"/>
+            <w:tcW w:type="dxa" w:w="2900"/>
+            <w:shd w:fill="D9E2F3" w:val="clear"/>
+            <w:tcMar>
+              <w:top w:type="dxa" w:w="100"/>
+              <w:left w:type="dxa" w:w="120"/>
+              <w:bottom w:type="dxa" w:w="100"/>
+              <w:right w:type="dxa" w:w="120"/>
+            </w:tcMar>
           </w:tcPr>
           <w:p>
             <w:r>
               <w:rPr>
                 <w:b/>
                 <w:bCs/>
-                <w:color w:val="FFFFFF"/>
-                <w:sz w:val="18"/>
-                <w:szCs w:val="18"/>
               </w:rPr>
               <w:t xml:space="preserve">Justificativa / Origem</w:t>
             </w:r>
@@ -1273,55 +1405,63 @@
         <w:tc>
           <w:tcPr>
             <w:tcW w:type="dxa" w:w="700"/>
-          </w:tcPr>
-          <w:p>
-            <w:r>
-              <w:rPr>
-                <w:sz w:val="18"/>
-                <w:szCs w:val="18"/>
-              </w:rPr>
+            <w:tcMar>
+              <w:top w:type="dxa" w:w="100"/>
+              <w:left w:type="dxa" w:w="120"/>
+              <w:bottom w:type="dxa" w:w="100"/>
+              <w:right w:type="dxa" w:w="120"/>
+            </w:tcMar>
+          </w:tcPr>
+          <w:p>
+            <w:r>
               <w:t xml:space="preserve">RNF01</w:t>
             </w:r>
           </w:p>
         </w:tc>
         <w:tc>
           <w:tcPr>
-            <w:tcW w:type="dxa" w:w="4700"/>
-          </w:tcPr>
-          <w:p>
-            <w:r>
-              <w:rPr>
-                <w:sz w:val="18"/>
-                <w:szCs w:val="18"/>
-              </w:rPr>
+            <w:tcW w:type="dxa" w:w="4300"/>
+            <w:tcMar>
+              <w:top w:type="dxa" w:w="100"/>
+              <w:left w:type="dxa" w:w="120"/>
+              <w:bottom w:type="dxa" w:w="100"/>
+              <w:right w:type="dxa" w:w="120"/>
+            </w:tcMar>
+          </w:tcPr>
+          <w:p>
+            <w:r>
               <w:t xml:space="preserve">O sistema deve refletir um novo pedido registrado na comanda em, no máximo, X segundos (valor a definir).</w:t>
             </w:r>
           </w:p>
         </w:tc>
         <w:tc>
           <w:tcPr>
-            <w:tcW w:type="dxa" w:w="1560"/>
-          </w:tcPr>
-          <w:p>
-            <w:r>
-              <w:rPr>
-                <w:sz w:val="18"/>
-                <w:szCs w:val="18"/>
-              </w:rPr>
+            <w:tcW w:type="dxa" w:w="1600"/>
+            <w:tcMar>
+              <w:top w:type="dxa" w:w="100"/>
+              <w:left w:type="dxa" w:w="120"/>
+              <w:bottom w:type="dxa" w:w="100"/>
+              <w:right w:type="dxa" w:w="120"/>
+            </w:tcMar>
+          </w:tcPr>
+          <w:p>
+            <w:r>
               <w:t xml:space="preserve">Desempenho</w:t>
             </w:r>
           </w:p>
         </w:tc>
         <w:tc>
           <w:tcPr>
-            <w:tcW w:type="dxa" w:w="2400"/>
-          </w:tcPr>
-          <w:p>
-            <w:r>
-              <w:rPr>
-                <w:sz w:val="18"/>
-                <w:szCs w:val="18"/>
-              </w:rPr>
+            <w:tcW w:type="dxa" w:w="2900"/>
+            <w:tcMar>
+              <w:top w:type="dxa" w:w="100"/>
+              <w:left w:type="dxa" w:w="120"/>
+              <w:bottom w:type="dxa" w:w="100"/>
+              <w:right w:type="dxa" w:w="120"/>
+            </w:tcMar>
+          </w:tcPr>
+          <w:p>
+            <w:r>
               <w:t xml:space="preserve">Maior incômodo relatado pelos clientes (50%); confirmado na entrevista (travamentos do sistema atual do Cocobambu).</w:t>
             </w:r>
           </w:p>
@@ -1331,55 +1471,63 @@
         <w:tc>
           <w:tcPr>
             <w:tcW w:type="dxa" w:w="700"/>
-          </w:tcPr>
-          <w:p>
-            <w:r>
-              <w:rPr>
-                <w:sz w:val="18"/>
-                <w:szCs w:val="18"/>
-              </w:rPr>
+            <w:tcMar>
+              <w:top w:type="dxa" w:w="100"/>
+              <w:left w:type="dxa" w:w="120"/>
+              <w:bottom w:type="dxa" w:w="100"/>
+              <w:right w:type="dxa" w:w="120"/>
+            </w:tcMar>
+          </w:tcPr>
+          <w:p>
+            <w:r>
               <w:t xml:space="preserve">RNF02</w:t>
             </w:r>
           </w:p>
         </w:tc>
         <w:tc>
           <w:tcPr>
-            <w:tcW w:type="dxa" w:w="4700"/>
-          </w:tcPr>
-          <w:p>
-            <w:r>
-              <w:rPr>
-                <w:sz w:val="18"/>
-                <w:szCs w:val="18"/>
-              </w:rPr>
+            <w:tcW w:type="dxa" w:w="4300"/>
+            <w:tcMar>
+              <w:top w:type="dxa" w:w="100"/>
+              <w:left w:type="dxa" w:w="120"/>
+              <w:bottom w:type="dxa" w:w="100"/>
+              <w:right w:type="dxa" w:w="120"/>
+            </w:tcMar>
+          </w:tcPr>
+          <w:p>
+            <w:r>
               <w:t xml:space="preserve">A interface de comanda do Garçom deve permitir abrir mesa e registrar pedido em, no máximo, N toques/passos (valor a definir).</w:t>
             </w:r>
           </w:p>
         </w:tc>
         <w:tc>
           <w:tcPr>
-            <w:tcW w:type="dxa" w:w="1560"/>
-          </w:tcPr>
-          <w:p>
-            <w:r>
-              <w:rPr>
-                <w:sz w:val="18"/>
-                <w:szCs w:val="18"/>
-              </w:rPr>
+            <w:tcW w:type="dxa" w:w="1600"/>
+            <w:tcMar>
+              <w:top w:type="dxa" w:w="100"/>
+              <w:left w:type="dxa" w:w="120"/>
+              <w:bottom w:type="dxa" w:w="100"/>
+              <w:right w:type="dxa" w:w="120"/>
+            </w:tcMar>
+          </w:tcPr>
+          <w:p>
+            <w:r>
               <w:t xml:space="preserve">Usabilidade</w:t>
             </w:r>
           </w:p>
         </w:tc>
         <w:tc>
           <w:tcPr>
-            <w:tcW w:type="dxa" w:w="2400"/>
-          </w:tcPr>
-          <w:p>
-            <w:r>
-              <w:rPr>
-                <w:sz w:val="18"/>
-                <w:szCs w:val="18"/>
-              </w:rPr>
+            <w:tcW w:type="dxa" w:w="2900"/>
+            <w:tcMar>
+              <w:top w:type="dxa" w:w="100"/>
+              <w:left w:type="dxa" w:w="120"/>
+              <w:bottom w:type="dxa" w:w="100"/>
+              <w:right w:type="dxa" w:w="120"/>
+            </w:tcMar>
+          </w:tcPr>
+          <w:p>
+            <w:r>
               <w:t xml:space="preserve">Meta testável ligada ao mesmo achado de demora.</w:t>
             </w:r>
           </w:p>
@@ -1389,55 +1537,63 @@
         <w:tc>
           <w:tcPr>
             <w:tcW w:type="dxa" w:w="700"/>
-          </w:tcPr>
-          <w:p>
-            <w:r>
-              <w:rPr>
-                <w:sz w:val="18"/>
-                <w:szCs w:val="18"/>
-              </w:rPr>
+            <w:tcMar>
+              <w:top w:type="dxa" w:w="100"/>
+              <w:left w:type="dxa" w:w="120"/>
+              <w:bottom w:type="dxa" w:w="100"/>
+              <w:right w:type="dxa" w:w="120"/>
+            </w:tcMar>
+          </w:tcPr>
+          <w:p>
+            <w:r>
               <w:t xml:space="preserve">RNF03</w:t>
             </w:r>
           </w:p>
         </w:tc>
         <w:tc>
           <w:tcPr>
-            <w:tcW w:type="dxa" w:w="4700"/>
-          </w:tcPr>
-          <w:p>
-            <w:r>
-              <w:rPr>
-                <w:sz w:val="18"/>
-                <w:szCs w:val="18"/>
-              </w:rPr>
+            <w:tcW w:type="dxa" w:w="4300"/>
+            <w:tcMar>
+              <w:top w:type="dxa" w:w="100"/>
+              <w:left w:type="dxa" w:w="120"/>
+              <w:bottom w:type="dxa" w:w="100"/>
+              <w:right w:type="dxa" w:w="120"/>
+            </w:tcMar>
+          </w:tcPr>
+          <w:p>
+            <w:r>
               <w:t xml:space="preserve">Dados pessoais do cliente devem ser armazenados com minimização e acesso restrito por papel.</w:t>
             </w:r>
           </w:p>
         </w:tc>
         <w:tc>
           <w:tcPr>
-            <w:tcW w:type="dxa" w:w="1560"/>
-          </w:tcPr>
-          <w:p>
-            <w:r>
-              <w:rPr>
-                <w:sz w:val="18"/>
-                <w:szCs w:val="18"/>
-              </w:rPr>
+            <w:tcW w:type="dxa" w:w="1600"/>
+            <w:tcMar>
+              <w:top w:type="dxa" w:w="100"/>
+              <w:left w:type="dxa" w:w="120"/>
+              <w:bottom w:type="dxa" w:w="100"/>
+              <w:right w:type="dxa" w:w="120"/>
+            </w:tcMar>
+          </w:tcPr>
+          <w:p>
+            <w:r>
               <w:t xml:space="preserve">Privacidade / LGPD</w:t>
             </w:r>
           </w:p>
         </w:tc>
         <w:tc>
           <w:tcPr>
-            <w:tcW w:type="dxa" w:w="2400"/>
-          </w:tcPr>
-          <w:p>
-            <w:r>
-              <w:rPr>
-                <w:sz w:val="18"/>
-                <w:szCs w:val="18"/>
-              </w:rPr>
+            <w:tcW w:type="dxa" w:w="2900"/>
+            <w:tcMar>
+              <w:top w:type="dxa" w:w="100"/>
+              <w:left w:type="dxa" w:w="120"/>
+              <w:bottom w:type="dxa" w:w="100"/>
+              <w:right w:type="dxa" w:w="120"/>
+            </w:tcMar>
+          </w:tcPr>
+          <w:p>
+            <w:r>
               <w:t xml:space="preserve">Princípio de minimização (LGPD, Art. 6º).</w:t>
             </w:r>
           </w:p>
@@ -1447,55 +1603,63 @@
         <w:tc>
           <w:tcPr>
             <w:tcW w:type="dxa" w:w="700"/>
-          </w:tcPr>
-          <w:p>
-            <w:r>
-              <w:rPr>
-                <w:sz w:val="18"/>
-                <w:szCs w:val="18"/>
-              </w:rPr>
+            <w:tcMar>
+              <w:top w:type="dxa" w:w="100"/>
+              <w:left w:type="dxa" w:w="120"/>
+              <w:bottom w:type="dxa" w:w="100"/>
+              <w:right w:type="dxa" w:w="120"/>
+            </w:tcMar>
+          </w:tcPr>
+          <w:p>
+            <w:r>
               <w:t xml:space="preserve">RNF04</w:t>
             </w:r>
           </w:p>
         </w:tc>
         <w:tc>
           <w:tcPr>
-            <w:tcW w:type="dxa" w:w="4700"/>
-          </w:tcPr>
-          <w:p>
-            <w:r>
-              <w:rPr>
-                <w:sz w:val="18"/>
-                <w:szCs w:val="18"/>
-              </w:rPr>
+            <w:tcW w:type="dxa" w:w="4300"/>
+            <w:tcMar>
+              <w:top w:type="dxa" w:w="100"/>
+              <w:left w:type="dxa" w:w="120"/>
+              <w:bottom w:type="dxa" w:w="100"/>
+              <w:right w:type="dxa" w:w="120"/>
+            </w:tcMar>
+          </w:tcPr>
+          <w:p>
+            <w:r>
               <w:t xml:space="preserve">Cada papel (Gerente, Coordenador, Metre, Garçom) deve ter permissões de leitura/escrita distintas conforme matriz de acesso.</w:t>
             </w:r>
           </w:p>
         </w:tc>
         <w:tc>
           <w:tcPr>
-            <w:tcW w:type="dxa" w:w="1560"/>
-          </w:tcPr>
-          <w:p>
-            <w:r>
-              <w:rPr>
-                <w:sz w:val="18"/>
-                <w:szCs w:val="18"/>
-              </w:rPr>
+            <w:tcW w:type="dxa" w:w="1600"/>
+            <w:tcMar>
+              <w:top w:type="dxa" w:w="100"/>
+              <w:left w:type="dxa" w:w="120"/>
+              <w:bottom w:type="dxa" w:w="100"/>
+              <w:right w:type="dxa" w:w="120"/>
+            </w:tcMar>
+          </w:tcPr>
+          <w:p>
+            <w:r>
               <w:t xml:space="preserve">Segurança</w:t>
             </w:r>
           </w:p>
         </w:tc>
         <w:tc>
           <w:tcPr>
-            <w:tcW w:type="dxa" w:w="2400"/>
-          </w:tcPr>
-          <w:p>
-            <w:r>
-              <w:rPr>
-                <w:sz w:val="18"/>
-                <w:szCs w:val="18"/>
-              </w:rPr>
+            <w:tcW w:type="dxa" w:w="2900"/>
+            <w:tcMar>
+              <w:top w:type="dxa" w:w="100"/>
+              <w:left w:type="dxa" w:w="120"/>
+              <w:bottom w:type="dxa" w:w="100"/>
+              <w:right w:type="dxa" w:w="120"/>
+            </w:tcMar>
+          </w:tcPr>
+          <w:p>
+            <w:r>
               <w:t xml:space="preserve">RBAC, já modelado para o front-of-house.</w:t>
             </w:r>
           </w:p>
@@ -1505,55 +1669,63 @@
         <w:tc>
           <w:tcPr>
             <w:tcW w:type="dxa" w:w="700"/>
-          </w:tcPr>
-          <w:p>
-            <w:r>
-              <w:rPr>
-                <w:sz w:val="18"/>
-                <w:szCs w:val="18"/>
-              </w:rPr>
+            <w:tcMar>
+              <w:top w:type="dxa" w:w="100"/>
+              <w:left w:type="dxa" w:w="120"/>
+              <w:bottom w:type="dxa" w:w="100"/>
+              <w:right w:type="dxa" w:w="120"/>
+            </w:tcMar>
+          </w:tcPr>
+          <w:p>
+            <w:r>
               <w:t xml:space="preserve">RNF05</w:t>
             </w:r>
           </w:p>
         </w:tc>
         <w:tc>
           <w:tcPr>
-            <w:tcW w:type="dxa" w:w="4700"/>
-          </w:tcPr>
-          <w:p>
-            <w:r>
-              <w:rPr>
-                <w:sz w:val="18"/>
-                <w:szCs w:val="18"/>
-              </w:rPr>
+            <w:tcW w:type="dxa" w:w="4300"/>
+            <w:tcMar>
+              <w:top w:type="dxa" w:w="100"/>
+              <w:left w:type="dxa" w:w="120"/>
+              <w:bottom w:type="dxa" w:w="100"/>
+              <w:right w:type="dxa" w:w="120"/>
+            </w:tcMar>
+          </w:tcPr>
+          <w:p>
+            <w:r>
               <w:t xml:space="preserve">O núcleo do módulo de comanda deve estar operacional durante todo o horário de funcionamento.</w:t>
             </w:r>
           </w:p>
         </w:tc>
         <w:tc>
           <w:tcPr>
-            <w:tcW w:type="dxa" w:w="1560"/>
-          </w:tcPr>
-          <w:p>
-            <w:r>
-              <w:rPr>
-                <w:sz w:val="18"/>
-                <w:szCs w:val="18"/>
-              </w:rPr>
+            <w:tcW w:type="dxa" w:w="1600"/>
+            <w:tcMar>
+              <w:top w:type="dxa" w:w="100"/>
+              <w:left w:type="dxa" w:w="120"/>
+              <w:bottom w:type="dxa" w:w="100"/>
+              <w:right w:type="dxa" w:w="120"/>
+            </w:tcMar>
+          </w:tcPr>
+          <w:p>
+            <w:r>
               <w:t xml:space="preserve">Disponibilidade</w:t>
             </w:r>
           </w:p>
         </w:tc>
         <w:tc>
           <w:tcPr>
-            <w:tcW w:type="dxa" w:w="2400"/>
-          </w:tcPr>
-          <w:p>
-            <w:r>
-              <w:rPr>
-                <w:sz w:val="18"/>
-                <w:szCs w:val="18"/>
-              </w:rPr>
+            <w:tcW w:type="dxa" w:w="2900"/>
+            <w:tcMar>
+              <w:top w:type="dxa" w:w="100"/>
+              <w:left w:type="dxa" w:w="120"/>
+              <w:bottom w:type="dxa" w:w="100"/>
+              <w:right w:type="dxa" w:w="120"/>
+            </w:tcMar>
+          </w:tcPr>
+          <w:p>
+            <w:r>
               <w:t xml:space="preserve">Alimenta os blocos analíticos — indisponibilidade compromete toda a operação.</w:t>
             </w:r>
           </w:p>
@@ -1563,7 +1735,7 @@
     <w:p>
       <w:pPr>
         <w:pStyle w:val="Heading1"/>
-        <w:spacing w:after="160" w:before="320"/>
+        <w:spacing w:after="150" w:before="300"/>
       </w:pPr>
       <w:r>
         <w:t xml:space="preserve">5. Regras de Negócio (RN)</w:t>
@@ -1571,7 +1743,7 @@
     </w:p>
     <w:tbl>
       <w:tblPr>
-        <w:tblW w:type="dxa" w:w="9360"/>
+        <w:tblW w:type="dxa" w:w="9500"/>
         <w:tblBorders>
           <w:top w:val="single" w:color="auto" w:sz="4"/>
           <w:left w:val="single" w:color="auto" w:sz="4"/>
@@ -1582,9 +1754,9 @@
         </w:tblBorders>
       </w:tblPr>
       <w:tblGrid>
-        <w:gridCol w:w="900"/>
-        <w:gridCol w:w="5300"/>
-        <w:gridCol w:w="3160"/>
+        <w:gridCol w:w="700"/>
+        <w:gridCol w:w="4900"/>
+        <w:gridCol w:w="3900"/>
       </w:tblGrid>
       <w:tr>
         <w:trPr>
@@ -1592,17 +1764,20 @@
         </w:trPr>
         <w:tc>
           <w:tcPr>
-            <w:tcW w:type="dxa" w:w="900"/>
-            <w:shd w:fill="2F5233" w:val="clear"/>
+            <w:tcW w:type="dxa" w:w="700"/>
+            <w:shd w:fill="D9E2F3" w:val="clear"/>
+            <w:tcMar>
+              <w:top w:type="dxa" w:w="100"/>
+              <w:left w:type="dxa" w:w="120"/>
+              <w:bottom w:type="dxa" w:w="100"/>
+              <w:right w:type="dxa" w:w="120"/>
+            </w:tcMar>
           </w:tcPr>
           <w:p>
             <w:r>
               <w:rPr>
                 <w:b/>
                 <w:bCs/>
-                <w:color w:val="FFFFFF"/>
-                <w:sz w:val="18"/>
-                <w:szCs w:val="18"/>
               </w:rPr>
               <w:t xml:space="preserve">ID</w:t>
             </w:r>
@@ -1610,17 +1785,20 @@
         </w:tc>
         <w:tc>
           <w:tcPr>
-            <w:tcW w:type="dxa" w:w="5300"/>
-            <w:shd w:fill="2F5233" w:val="clear"/>
+            <w:tcW w:type="dxa" w:w="4900"/>
+            <w:shd w:fill="D9E2F3" w:val="clear"/>
+            <w:tcMar>
+              <w:top w:type="dxa" w:w="100"/>
+              <w:left w:type="dxa" w:w="120"/>
+              <w:bottom w:type="dxa" w:w="100"/>
+              <w:right w:type="dxa" w:w="120"/>
+            </w:tcMar>
           </w:tcPr>
           <w:p>
             <w:r>
               <w:rPr>
                 <w:b/>
                 <w:bCs/>
-                <w:color w:val="FFFFFF"/>
-                <w:sz w:val="18"/>
-                <w:szCs w:val="18"/>
               </w:rPr>
               <w:t xml:space="preserve">Regra</w:t>
             </w:r>
@@ -1628,17 +1806,20 @@
         </w:tc>
         <w:tc>
           <w:tcPr>
-            <w:tcW w:type="dxa" w:w="3160"/>
-            <w:shd w:fill="2F5233" w:val="clear"/>
+            <w:tcW w:type="dxa" w:w="3900"/>
+            <w:shd w:fill="D9E2F3" w:val="clear"/>
+            <w:tcMar>
+              <w:top w:type="dxa" w:w="100"/>
+              <w:left w:type="dxa" w:w="120"/>
+              <w:bottom w:type="dxa" w:w="100"/>
+              <w:right w:type="dxa" w:w="120"/>
+            </w:tcMar>
           </w:tcPr>
           <w:p>
             <w:r>
               <w:rPr>
                 <w:b/>
                 <w:bCs/>
-                <w:color w:val="FFFFFF"/>
-                <w:sz w:val="18"/>
-                <w:szCs w:val="18"/>
               </w:rPr>
               <w:t xml:space="preserve">Racional</w:t>
             </w:r>
@@ -1648,42 +1829,48 @@
       <w:tr>
         <w:tc>
           <w:tcPr>
-            <w:tcW w:type="dxa" w:w="900"/>
-          </w:tcPr>
-          <w:p>
-            <w:r>
-              <w:rPr>
-                <w:sz w:val="18"/>
-                <w:szCs w:val="18"/>
-              </w:rPr>
+            <w:tcW w:type="dxa" w:w="700"/>
+            <w:tcMar>
+              <w:top w:type="dxa" w:w="100"/>
+              <w:left w:type="dxa" w:w="120"/>
+              <w:bottom w:type="dxa" w:w="100"/>
+              <w:right w:type="dxa" w:w="120"/>
+            </w:tcMar>
+          </w:tcPr>
+          <w:p>
+            <w:r>
               <w:t xml:space="preserve">RN01</w:t>
             </w:r>
           </w:p>
         </w:tc>
         <w:tc>
           <w:tcPr>
-            <w:tcW w:type="dxa" w:w="5300"/>
-          </w:tcPr>
-          <w:p>
-            <w:r>
-              <w:rPr>
-                <w:sz w:val="18"/>
-                <w:szCs w:val="18"/>
-              </w:rPr>
+            <w:tcW w:type="dxa" w:w="4900"/>
+            <w:tcMar>
+              <w:top w:type="dxa" w:w="100"/>
+              <w:left w:type="dxa" w:w="120"/>
+              <w:bottom w:type="dxa" w:w="100"/>
+              <w:right w:type="dxa" w:w="120"/>
+            </w:tcMar>
+          </w:tcPr>
+          <w:p>
+            <w:r>
               <w:t xml:space="preserve">Composição da mesa: Solo (1) / Casal (2) / Grupo pequeno (3–4, sem item infantil) / Família (3+, com item infantil) / Grupo grande (5+).</w:t>
             </w:r>
           </w:p>
         </w:tc>
         <w:tc>
           <w:tcPr>
-            <w:tcW w:type="dxa" w:w="3160"/>
-          </w:tcPr>
-          <w:p>
-            <w:r>
-              <w:rPr>
-                <w:sz w:val="18"/>
-                <w:szCs w:val="18"/>
-              </w:rPr>
+            <w:tcW w:type="dxa" w:w="3900"/>
+            <w:tcMar>
+              <w:top w:type="dxa" w:w="100"/>
+              <w:left w:type="dxa" w:w="120"/>
+              <w:bottom w:type="dxa" w:w="100"/>
+              <w:right w:type="dxa" w:w="120"/>
+            </w:tcMar>
+          </w:tcPr>
+          <w:p>
+            <w:r>
               <w:t xml:space="preserve">Fechado em 13/08/2026; confirmado pela entrevista — sem item infantil pedido, não há sinal para inferir sozinho.</w:t>
             </w:r>
           </w:p>
@@ -1692,42 +1879,48 @@
       <w:tr>
         <w:tc>
           <w:tcPr>
-            <w:tcW w:type="dxa" w:w="900"/>
-          </w:tcPr>
-          <w:p>
-            <w:r>
-              <w:rPr>
-                <w:sz w:val="18"/>
-                <w:szCs w:val="18"/>
-              </w:rPr>
+            <w:tcW w:type="dxa" w:w="700"/>
+            <w:tcMar>
+              <w:top w:type="dxa" w:w="100"/>
+              <w:left w:type="dxa" w:w="120"/>
+              <w:bottom w:type="dxa" w:w="100"/>
+              <w:right w:type="dxa" w:w="120"/>
+            </w:tcMar>
+          </w:tcPr>
+          <w:p>
+            <w:r>
               <w:t xml:space="preserve">RN02</w:t>
             </w:r>
           </w:p>
         </w:tc>
         <w:tc>
           <w:tcPr>
-            <w:tcW w:type="dxa" w:w="5300"/>
-          </w:tcPr>
-          <w:p>
-            <w:r>
-              <w:rPr>
-                <w:sz w:val="18"/>
-                <w:szCs w:val="18"/>
-              </w:rPr>
+            <w:tcW w:type="dxa" w:w="4900"/>
+            <w:tcMar>
+              <w:top w:type="dxa" w:w="100"/>
+              <w:left w:type="dxa" w:w="120"/>
+              <w:bottom w:type="dxa" w:w="100"/>
+              <w:right w:type="dxa" w:w="120"/>
+            </w:tcMar>
+          </w:tcPr>
+          <w:p>
+            <w:r>
               <w:t xml:space="preserve">Uma comanda só pode ser fechada se todos os itens estiverem "entregue" ou com cancelamento justificado; itens pendentes ficam visíveis como lembrete ativo (não só trava de fechamento).</w:t>
             </w:r>
           </w:p>
         </w:tc>
         <w:tc>
           <w:tcPr>
-            <w:tcW w:type="dxa" w:w="3160"/>
-          </w:tcPr>
-          <w:p>
-            <w:r>
-              <w:rPr>
-                <w:sz w:val="18"/>
-                <w:szCs w:val="18"/>
-              </w:rPr>
+            <w:tcW w:type="dxa" w:w="3900"/>
+            <w:tcMar>
+              <w:top w:type="dxa" w:w="100"/>
+              <w:left w:type="dxa" w:w="120"/>
+              <w:bottom w:type="dxa" w:w="100"/>
+              <w:right w:type="dxa" w:w="120"/>
+            </w:tcMar>
+          </w:tcPr>
+          <w:p>
+            <w:r>
               <w:t xml:space="preserve">Refinado pela entrevista — evita itens esquecidos (ex.: água) até o momento do fechamento.</w:t>
             </w:r>
           </w:p>
@@ -1736,42 +1929,48 @@
       <w:tr>
         <w:tc>
           <w:tcPr>
-            <w:tcW w:type="dxa" w:w="900"/>
-          </w:tcPr>
-          <w:p>
-            <w:r>
-              <w:rPr>
-                <w:sz w:val="18"/>
-                <w:szCs w:val="18"/>
-              </w:rPr>
+            <w:tcW w:type="dxa" w:w="700"/>
+            <w:tcMar>
+              <w:top w:type="dxa" w:w="100"/>
+              <w:left w:type="dxa" w:w="120"/>
+              <w:bottom w:type="dxa" w:w="100"/>
+              <w:right w:type="dxa" w:w="120"/>
+            </w:tcMar>
+          </w:tcPr>
+          <w:p>
+            <w:r>
               <w:t xml:space="preserve">RN03</w:t>
             </w:r>
           </w:p>
         </w:tc>
         <w:tc>
           <w:tcPr>
-            <w:tcW w:type="dxa" w:w="5300"/>
-          </w:tcPr>
-          <w:p>
-            <w:r>
-              <w:rPr>
-                <w:sz w:val="18"/>
-                <w:szCs w:val="18"/>
-              </w:rPr>
+            <w:tcW w:type="dxa" w:w="4900"/>
+            <w:tcMar>
+              <w:top w:type="dxa" w:w="100"/>
+              <w:left w:type="dxa" w:w="120"/>
+              <w:bottom w:type="dxa" w:w="100"/>
+              <w:right w:type="dxa" w:w="120"/>
+            </w:tcMar>
+          </w:tcPr>
+          <w:p>
+            <w:r>
               <w:t xml:space="preserve">A alocação de garçons deve equilibrar o faturamento acumulado por garçom, ponderado pelo faturamento médio histórico da praça (ver seção 3.1).</w:t>
             </w:r>
           </w:p>
         </w:tc>
         <w:tc>
           <w:tcPr>
-            <w:tcW w:type="dxa" w:w="3160"/>
-          </w:tcPr>
-          <w:p>
-            <w:r>
-              <w:rPr>
-                <w:sz w:val="18"/>
-                <w:szCs w:val="18"/>
-              </w:rPr>
+            <w:tcW w:type="dxa" w:w="3900"/>
+            <w:tcMar>
+              <w:top w:type="dxa" w:w="100"/>
+              <w:left w:type="dxa" w:w="120"/>
+              <w:bottom w:type="dxa" w:w="100"/>
+              <w:right w:type="dxa" w:w="120"/>
+            </w:tcMar>
+          </w:tcPr>
+          <w:p>
+            <w:r>
               <w:t xml:space="preserve">Proposta da dupla (21/08/2026), baseada em entrevista + questionário — pendente de validação final com o orientador.</w:t>
             </w:r>
           </w:p>
@@ -1780,42 +1979,48 @@
       <w:tr>
         <w:tc>
           <w:tcPr>
-            <w:tcW w:type="dxa" w:w="900"/>
-          </w:tcPr>
-          <w:p>
-            <w:r>
-              <w:rPr>
-                <w:sz w:val="18"/>
-                <w:szCs w:val="18"/>
-              </w:rPr>
+            <w:tcW w:type="dxa" w:w="700"/>
+            <w:tcMar>
+              <w:top w:type="dxa" w:w="100"/>
+              <w:left w:type="dxa" w:w="120"/>
+              <w:bottom w:type="dxa" w:w="100"/>
+              <w:right w:type="dxa" w:w="120"/>
+            </w:tcMar>
+          </w:tcPr>
+          <w:p>
+            <w:r>
               <w:t xml:space="preserve">RN04</w:t>
             </w:r>
           </w:p>
         </w:tc>
         <w:tc>
           <w:tcPr>
-            <w:tcW w:type="dxa" w:w="5300"/>
-          </w:tcPr>
-          <w:p>
-            <w:r>
-              <w:rPr>
-                <w:sz w:val="18"/>
-                <w:szCs w:val="18"/>
-              </w:rPr>
+            <w:tcW w:type="dxa" w:w="4900"/>
+            <w:tcMar>
+              <w:top w:type="dxa" w:w="100"/>
+              <w:left w:type="dxa" w:w="120"/>
+              <w:bottom w:type="dxa" w:w="100"/>
+              <w:right w:type="dxa" w:w="120"/>
+            </w:tcMar>
+          </w:tcPr>
+          <w:p>
+            <w:r>
               <w:t xml:space="preserve">Dados pessoais do cliente só acessíveis por Garçom/Metre no contexto da mesa ativa; fora disso, apenas agregado/anonimizado.</w:t>
             </w:r>
           </w:p>
         </w:tc>
         <w:tc>
           <w:tcPr>
-            <w:tcW w:type="dxa" w:w="3160"/>
-          </w:tcPr>
-          <w:p>
-            <w:r>
-              <w:rPr>
-                <w:sz w:val="18"/>
-                <w:szCs w:val="18"/>
-              </w:rPr>
+            <w:tcW w:type="dxa" w:w="3900"/>
+            <w:tcMar>
+              <w:top w:type="dxa" w:w="100"/>
+              <w:left w:type="dxa" w:w="120"/>
+              <w:bottom w:type="dxa" w:w="100"/>
+              <w:right w:type="dxa" w:w="120"/>
+            </w:tcMar>
+          </w:tcPr>
+          <w:p>
+            <w:r>
               <w:t xml:space="preserve">LGPD, Art. 6º.</w:t>
             </w:r>
           </w:p>
@@ -1824,42 +2029,48 @@
       <w:tr>
         <w:tc>
           <w:tcPr>
-            <w:tcW w:type="dxa" w:w="900"/>
-          </w:tcPr>
-          <w:p>
-            <w:r>
-              <w:rPr>
-                <w:sz w:val="18"/>
-                <w:szCs w:val="18"/>
-              </w:rPr>
+            <w:tcW w:type="dxa" w:w="700"/>
+            <w:tcMar>
+              <w:top w:type="dxa" w:w="100"/>
+              <w:left w:type="dxa" w:w="120"/>
+              <w:bottom w:type="dxa" w:w="100"/>
+              <w:right w:type="dxa" w:w="120"/>
+            </w:tcMar>
+          </w:tcPr>
+          <w:p>
+            <w:r>
               <w:t xml:space="preserve">RN05</w:t>
             </w:r>
           </w:p>
         </w:tc>
         <w:tc>
           <w:tcPr>
-            <w:tcW w:type="dxa" w:w="5300"/>
-          </w:tcPr>
-          <w:p>
-            <w:r>
-              <w:rPr>
-                <w:sz w:val="18"/>
-                <w:szCs w:val="18"/>
-              </w:rPr>
+            <w:tcW w:type="dxa" w:w="4900"/>
+            <w:tcMar>
+              <w:top w:type="dxa" w:w="100"/>
+              <w:left w:type="dxa" w:w="120"/>
+              <w:bottom w:type="dxa" w:w="100"/>
+              <w:right w:type="dxa" w:w="120"/>
+            </w:tcMar>
+          </w:tcPr>
+          <w:p>
+            <w:r>
               <w:t xml:space="preserve">O sistema não deve capturar, inferir ou armazenar atributos sensíveis do cliente para segmentação.</w:t>
             </w:r>
           </w:p>
         </w:tc>
         <w:tc>
           <w:tcPr>
-            <w:tcW w:type="dxa" w:w="3160"/>
-          </w:tcPr>
-          <w:p>
-            <w:r>
-              <w:rPr>
-                <w:sz w:val="18"/>
-                <w:szCs w:val="18"/>
-              </w:rPr>
+            <w:tcW w:type="dxa" w:w="3900"/>
+            <w:tcMar>
+              <w:top w:type="dxa" w:w="100"/>
+              <w:left w:type="dxa" w:w="120"/>
+              <w:bottom w:type="dxa" w:w="100"/>
+              <w:right w:type="dxa" w:w="120"/>
+            </w:tcMar>
+          </w:tcPr>
+          <w:p>
+            <w:r>
               <w:t xml:space="preserve">Risco de viés/discriminação; dado de saúde é sensível por definição legal (LGPD, Art. 5º, II).</w:t>
             </w:r>
           </w:p>
@@ -1869,7 +2080,7 @@
     <w:p>
       <w:pPr>
         <w:pStyle w:val="Heading1"/>
-        <w:spacing w:after="160" w:before="320"/>
+        <w:spacing w:after="150" w:before="300"/>
       </w:pPr>
       <w:r>
         <w:t xml:space="preserve">6. Pendências restantes</w:t>
@@ -1880,9 +2091,9 @@
         <w:pStyle w:val="ListParagraph"/>
         <w:numPr>
           <w:ilvl w:val="0"/>
-          <w:numId w:val="2"/>
+          <w:numId w:val="1"/>
         </w:numPr>
-        <w:spacing w:after="80"/>
+        <w:spacing w:after="150"/>
       </w:pPr>
       <w:r>
         <w:t xml:space="preserve">Calibração numérica de RNF01/RNF02 (valores de X segundos e N toques).</w:t>
@@ -1893,9 +2104,9 @@
         <w:pStyle w:val="ListParagraph"/>
         <w:numPr>
           <w:ilvl w:val="0"/>
-          <w:numId w:val="2"/>
+          <w:numId w:val="1"/>
         </w:numPr>
-        <w:spacing w:after="80"/>
+        <w:spacing w:after="150"/>
       </w:pPr>
       <w:r>
         <w:t xml:space="preserve">Calibração numérica dos limiares de suporte/confiança (RF09) — depende de volume de dado.</w:t>
@@ -1906,12 +2117,12 @@
         <w:pStyle w:val="ListParagraph"/>
         <w:numPr>
           <w:ilvl w:val="0"/>
-          <w:numId w:val="2"/>
+          <w:numId w:val="1"/>
         </w:numPr>
-        <w:spacing w:after="80"/>
-      </w:pPr>
-      <w:r>
-        <w:t xml:space="preserve">Validação final de RN03 (seção 3.1) com o orientador — a estrutura foi proposta, mas o valor exato dos pesos ainda não foi testado.</w:t>
+        <w:spacing w:after="150"/>
+      </w:pPr>
+      <w:r>
+        <w:t xml:space="preserve">Validação final de RN03 com o orientador (issue #26) e calibração numérica dos pesos (seção 3.1) — a estrutura da função objetivo já foi fechada (issue #6, 22/08/2026); falta validar formalmente com o orientador e calibrar com dado real/simulado.</w:t>
       </w:r>
     </w:p>
     <w:p>
@@ -1919,9 +2130,9 @@
         <w:pStyle w:val="ListParagraph"/>
         <w:numPr>
           <w:ilvl w:val="0"/>
-          <w:numId w:val="2"/>
+          <w:numId w:val="1"/>
         </w:numPr>
-        <w:spacing w:after="80"/>
+        <w:spacing w:after="150"/>
       </w:pPr>
       <w:r>
         <w:t xml:space="preserve">Qualificador livre vs. lista fechada para o garçom na composição da mesa — ainda não decidido.</w:t>
@@ -1930,7 +2141,7 @@
     <w:p>
       <w:pPr>
         <w:pStyle w:val="Heading1"/>
-        <w:spacing w:after="160" w:before="320"/>
+        <w:spacing w:after="150" w:before="300"/>
       </w:pPr>
       <w:r>
         <w:t xml:space="preserve">7. Próximo passo</w:t>
@@ -1938,15 +2149,23 @@
     </w:p>
     <w:p>
       <w:pPr>
-        <w:spacing w:after="160"/>
-      </w:pPr>
-      <w:r>
-        <w:t xml:space="preserve">Atualizar a Matriz de Rastreabilidade (documento irmão) refletindo os novos status de validação, e iniciar os artefatos complementares definidos na sessão de 21/08/2026: Business Model Canvas, User Stories, prototipagem/UX-UI, arquitetura, cenários de teste e manual do usuário.</w:t>
+        <w:spacing w:after="200"/>
+      </w:pPr>
+      <w:r>
+        <w:t xml:space="preserve">Sprint 1 encerra em 22/08/2026 com os artefatos de requisitos fechados: RF/RNF/RN, Matriz de Rastreabilidade, User Stories. Notação de diagramas confirmada (UML). Único item que carrega para a próxima feature/sprint: validação final de RN03 com o orientador + calibração numérica (issue #26).</w:t>
+      </w:r>
+    </w:p>
+    <w:p>
+      <w:pPr>
+        <w:spacing w:after="200"/>
+      </w:pPr>
+      <w:r>
+        <w:t xml:space="preserve">Business Model Canvas, MER/DER e diagramas de apoio (UML) ficam formalmente para a Sprint 2.</w:t>
       </w:r>
     </w:p>
     <w:sectPr>
-      <w:pgSz w:w="11906" w:h="16838" w:orient="portrait"/>
-      <w:pgMar w:top="1134" w:right="1134" w:bottom="1134" w:left="1134" w:header="708" w:footer="708" w:gutter="0"/>
+      <w:pgSz w:w="12240" w:h="15840" w:orient="portrait"/>
+      <w:pgMar w:top="1440" w:right="1440" w:bottom="1440" w:left="1440" w:header="708" w:footer="708" w:gutter="0"/>
       <w:pgNumType/>
       <w:docGrid w:linePitch="360"/>
     </w:sectPr>
@@ -2118,23 +2337,8 @@
       </w:pPr>
     </w:lvl>
   </w:abstractNum>
-  <w:abstractNum w:abstractNumId="2" w15:restartNumberingAfterBreak="0">
-    <w:multiLevelType w:val="hybridMultilevel"/>
-    <w:lvl w:ilvl="0" w15:tentative="1">
-      <w:start w:val="1"/>
-      <w:numFmt w:val="bullet"/>
-      <w:lvlText w:val="•"/>
-      <w:lvlJc w:val="left"/>
-    </w:lvl>
-  </w:abstractNum>
   <w:num w:numId="1">
     <w:abstractNumId w:val="1"/>
-    <w:lvlOverride w:ilvl="0">
-      <w:startOverride w:val="1"/>
-    </w:lvlOverride>
-  </w:num>
-  <w:num w:numId="2">
-    <w:abstractNumId w:val="2"/>
     <w:lvlOverride w:ilvl="0">
       <w:startOverride w:val="1"/>
     </w:lvlOverride>

</xml_diff>